<commit_message>
inscription client et lien de confirmation
</commit_message>
<xml_diff>
--- a/projet_memoire.docx
+++ b/projet_memoire.docx
@@ -25406,9 +25406,9 @@
         <w:lastRenderedPageBreak/>
         <w:drawing>
           <wp:inline distT="0" distB="0" distL="0" distR="0">
-            <wp:extent cx="5760720" cy="5942518"/>
-            <wp:effectExtent l="0" t="0" r="0" b="1270"/>
-            <wp:docPr id="8" name="Image 8" descr="D:\l3\Memoire_De_Fin_Cycle\photo\Client1.drawio.png"/>
+            <wp:extent cx="6235176" cy="5607088"/>
+            <wp:effectExtent l="0" t="0" r="0" b="0"/>
+            <wp:docPr id="12" name="Image 12" descr="D:\l3\Memoire_De_Fin_Cycle\photo\Client2.drawio.png"/>
             <wp:cNvGraphicFramePr>
               <a:graphicFrameLocks xmlns:a="http://schemas.openxmlformats.org/drawingml/2006/main" noChangeAspect="1"/>
             </wp:cNvGraphicFramePr>
@@ -25416,7 +25416,7 @@
               <a:graphicData uri="http://schemas.openxmlformats.org/drawingml/2006/picture">
                 <pic:pic xmlns:pic="http://schemas.openxmlformats.org/drawingml/2006/picture">
                   <pic:nvPicPr>
-                    <pic:cNvPr id="0" name="Picture 2" descr="D:\l3\Memoire_De_Fin_Cycle\photo\Client1.drawio.png"/>
+                    <pic:cNvPr id="0" name="Picture 2" descr="D:\l3\Memoire_De_Fin_Cycle\photo\Client2.drawio.png"/>
                     <pic:cNvPicPr>
                       <a:picLocks noChangeAspect="1" noChangeArrowheads="1"/>
                     </pic:cNvPicPr>
@@ -25437,7 +25437,7 @@
                   <pic:spPr bwMode="auto">
                     <a:xfrm>
                       <a:off x="0" y="0"/>
-                      <a:ext cx="5760720" cy="5942518"/>
+                      <a:ext cx="6237666" cy="5609327"/>
                     </a:xfrm>
                     <a:prstGeom prst="rect">
                       <a:avLst/>
@@ -25560,6 +25560,55 @@
     </w:p>
     <w:p>
       <w:pPr>
+        <w:pStyle w:val="Paragraphedeliste"/>
+        <w:numPr>
+          <w:ilvl w:val="1"/>
+          <w:numId w:val="29"/>
+        </w:numPr>
+        <w:tabs>
+          <w:tab w:val="left" w:pos="5560"/>
+        </w:tabs>
+        <w:rPr>
+          <w:rFonts w:ascii="Times New Roman" w:hAnsi="Times New Roman" w:cs="Times New Roman"/>
+          <w:sz w:val="24"/>
+          <w:szCs w:val="24"/>
+        </w:rPr>
+      </w:pPr>
+      <w:r>
+        <w:rPr>
+          <w:rFonts w:ascii="Times New Roman" w:hAnsi="Times New Roman" w:cs="Times New Roman"/>
+          <w:sz w:val="24"/>
+          <w:szCs w:val="24"/>
+        </w:rPr>
+        <w:t>Diagramme de cas</w:t>
+      </w:r>
+      <w:r>
+        <w:rPr>
+          <w:rFonts w:ascii="Times New Roman" w:hAnsi="Times New Roman" w:cs="Times New Roman"/>
+          <w:sz w:val="24"/>
+          <w:szCs w:val="24"/>
+        </w:rPr>
+        <w:t xml:space="preserve"> </w:t>
+      </w:r>
+      <w:r>
+        <w:rPr>
+          <w:rFonts w:ascii="Times New Roman" w:hAnsi="Times New Roman" w:cs="Times New Roman"/>
+          <w:sz w:val="24"/>
+          <w:szCs w:val="24"/>
+        </w:rPr>
+        <w:t>d'utilisation</w:t>
+      </w:r>
+      <w:r>
+        <w:rPr>
+          <w:rFonts w:ascii="Times New Roman" w:hAnsi="Times New Roman" w:cs="Times New Roman"/>
+          <w:sz w:val="24"/>
+          <w:szCs w:val="24"/>
+        </w:rPr>
+        <w:t xml:space="preserve"> Gestion administrative et commercial</w:t>
+      </w:r>
+    </w:p>
+    <w:p>
+      <w:pPr>
         <w:tabs>
           <w:tab w:val="left" w:pos="5560"/>
         </w:tabs>
@@ -25583,6 +25632,64 @@
           <w:szCs w:val="24"/>
         </w:rPr>
       </w:pPr>
+      <w:r>
+        <w:rPr>
+          <w:rFonts w:ascii="Times New Roman" w:hAnsi="Times New Roman" w:cs="Times New Roman"/>
+          <w:noProof/>
+          <w:sz w:val="24"/>
+          <w:szCs w:val="24"/>
+          <w:lang w:eastAsia="fr-FR"/>
+        </w:rPr>
+        <w:lastRenderedPageBreak/>
+        <w:drawing>
+          <wp:inline distT="0" distB="0" distL="0" distR="0" wp14:anchorId="03C83629" wp14:editId="32D26A3C">
+            <wp:extent cx="5760720" cy="5053330"/>
+            <wp:effectExtent l="0" t="0" r="0" b="0"/>
+            <wp:docPr id="9" name="Image 9" descr="D:\l3\Memoire_De_Fin_Cycle\photo\receptionniste1.drawio.png"/>
+            <wp:cNvGraphicFramePr>
+              <a:graphicFrameLocks xmlns:a="http://schemas.openxmlformats.org/drawingml/2006/main" noChangeAspect="1"/>
+            </wp:cNvGraphicFramePr>
+            <a:graphic xmlns:a="http://schemas.openxmlformats.org/drawingml/2006/main">
+              <a:graphicData uri="http://schemas.openxmlformats.org/drawingml/2006/picture">
+                <pic:pic xmlns:pic="http://schemas.openxmlformats.org/drawingml/2006/picture">
+                  <pic:nvPicPr>
+                    <pic:cNvPr id="0" name="Picture 3" descr="D:\l3\Memoire_De_Fin_Cycle\photo\receptionniste1.drawio.png"/>
+                    <pic:cNvPicPr>
+                      <a:picLocks noChangeAspect="1" noChangeArrowheads="1"/>
+                    </pic:cNvPicPr>
+                  </pic:nvPicPr>
+                  <pic:blipFill>
+                    <a:blip r:embed="rId12">
+                      <a:extLst>
+                        <a:ext uri="{28A0092B-C50C-407E-A947-70E740481C1C}">
+                          <a14:useLocalDpi xmlns:a14="http://schemas.microsoft.com/office/drawing/2010/main" val="0"/>
+                        </a:ext>
+                      </a:extLst>
+                    </a:blip>
+                    <a:srcRect/>
+                    <a:stretch>
+                      <a:fillRect/>
+                    </a:stretch>
+                  </pic:blipFill>
+                  <pic:spPr bwMode="auto">
+                    <a:xfrm>
+                      <a:off x="0" y="0"/>
+                      <a:ext cx="5760720" cy="5053330"/>
+                    </a:xfrm>
+                    <a:prstGeom prst="rect">
+                      <a:avLst/>
+                    </a:prstGeom>
+                    <a:noFill/>
+                    <a:ln>
+                      <a:noFill/>
+                    </a:ln>
+                  </pic:spPr>
+                </pic:pic>
+              </a:graphicData>
+            </a:graphic>
+          </wp:inline>
+        </w:drawing>
+      </w:r>
     </w:p>
     <w:p>
       <w:pPr>
@@ -25596,15 +25703,6 @@
           <w:szCs w:val="24"/>
         </w:rPr>
       </w:pPr>
-      <w:r>
-        <w:rPr>
-          <w:rFonts w:ascii="Times New Roman" w:hAnsi="Times New Roman" w:cs="Times New Roman"/>
-          <w:sz w:val="24"/>
-          <w:szCs w:val="24"/>
-        </w:rPr>
-        <w:lastRenderedPageBreak/>
-        <w:t>Diagramme de Séquence de s’Authentifier</w:t>
-      </w:r>
     </w:p>
     <w:p>
       <w:pPr>
@@ -25618,6 +25716,42 @@
           <w:szCs w:val="24"/>
         </w:rPr>
       </w:pPr>
+    </w:p>
+    <w:p>
+      <w:pPr>
+        <w:tabs>
+          <w:tab w:val="left" w:pos="5560"/>
+        </w:tabs>
+        <w:ind w:left="360"/>
+        <w:rPr>
+          <w:rFonts w:ascii="Times New Roman" w:hAnsi="Times New Roman" w:cs="Times New Roman"/>
+          <w:sz w:val="24"/>
+          <w:szCs w:val="24"/>
+        </w:rPr>
+      </w:pPr>
+      <w:bookmarkStart w:id="0" w:name="_GoBack"/>
+      <w:bookmarkEnd w:id="0"/>
+      <w:r>
+        <w:rPr>
+          <w:rFonts w:ascii="Times New Roman" w:hAnsi="Times New Roman" w:cs="Times New Roman"/>
+          <w:sz w:val="24"/>
+          <w:szCs w:val="24"/>
+        </w:rPr>
+        <w:t>Diagramme de Séquence de s’Authentifier</w:t>
+      </w:r>
+    </w:p>
+    <w:p>
+      <w:pPr>
+        <w:tabs>
+          <w:tab w:val="left" w:pos="5560"/>
+        </w:tabs>
+        <w:ind w:left="360"/>
+        <w:rPr>
+          <w:rFonts w:ascii="Times New Roman" w:hAnsi="Times New Roman" w:cs="Times New Roman"/>
+          <w:sz w:val="24"/>
+          <w:szCs w:val="24"/>
+        </w:rPr>
+      </w:pPr>
       <w:r>
         <w:rPr>
           <w:rFonts w:ascii="Times New Roman" w:hAnsi="Times New Roman" w:cs="Times New Roman"/>
@@ -25626,6 +25760,7 @@
           <w:szCs w:val="24"/>
           <w:lang w:eastAsia="fr-FR"/>
         </w:rPr>
+        <w:lastRenderedPageBreak/>
         <w:drawing>
           <wp:inline distT="0" distB="0" distL="0" distR="0">
             <wp:extent cx="4774557" cy="5793105"/>
@@ -25644,7 +25779,7 @@
                     </pic:cNvPicPr>
                   </pic:nvPicPr>
                   <pic:blipFill>
-                    <a:blip r:embed="rId12">
+                    <a:blip r:embed="rId13">
                       <a:extLst>
                         <a:ext uri="{28A0092B-C50C-407E-A947-70E740481C1C}">
                           <a14:useLocalDpi xmlns:a14="http://schemas.microsoft.com/office/drawing/2010/main" val="0"/>
@@ -25855,6 +25990,7 @@
           <w:sz w:val="24"/>
           <w:szCs w:val="24"/>
         </w:rPr>
+        <w:lastRenderedPageBreak/>
         <w:t>Description</w:t>
       </w:r>
     </w:p>
@@ -26448,7 +26584,6 @@
           <w:szCs w:val="24"/>
           <w:lang w:eastAsia="fr-FR"/>
         </w:rPr>
-        <w:lastRenderedPageBreak/>
         <w:t>Le système propose un autre créneau disponible</w:t>
       </w:r>
     </w:p>
@@ -26470,6 +26605,7 @@
           <w:szCs w:val="24"/>
           <w:lang w:eastAsia="fr-FR"/>
         </w:rPr>
+        <w:lastRenderedPageBreak/>
         <w:t>Le client recommence la sélection</w:t>
       </w:r>
     </w:p>
@@ -26523,7 +26659,7 @@
                     </pic:cNvPicPr>
                   </pic:nvPicPr>
                   <pic:blipFill>
-                    <a:blip r:embed="rId13">
+                    <a:blip r:embed="rId14">
                       <a:extLst>
                         <a:ext uri="{28A0092B-C50C-407E-A947-70E740481C1C}">
                           <a14:useLocalDpi xmlns:a14="http://schemas.microsoft.com/office/drawing/2010/main" val="0"/>
@@ -26570,63 +26706,6 @@
     </w:p>
     <w:p>
       <w:pPr>
-        <w:pStyle w:val="Paragraphedeliste"/>
-        <w:numPr>
-          <w:ilvl w:val="1"/>
-          <w:numId w:val="29"/>
-        </w:numPr>
-        <w:tabs>
-          <w:tab w:val="left" w:pos="5560"/>
-        </w:tabs>
-        <w:rPr>
-          <w:rFonts w:ascii="Times New Roman" w:hAnsi="Times New Roman" w:cs="Times New Roman"/>
-          <w:sz w:val="24"/>
-          <w:szCs w:val="24"/>
-        </w:rPr>
-      </w:pPr>
-      <w:r>
-        <w:rPr>
-          <w:rFonts w:ascii="Times New Roman" w:hAnsi="Times New Roman" w:cs="Times New Roman"/>
-          <w:sz w:val="24"/>
-          <w:szCs w:val="24"/>
-        </w:rPr>
-        <w:t>Diagramme de cas</w:t>
-      </w:r>
-      <w:r>
-        <w:rPr>
-          <w:rFonts w:ascii="Times New Roman" w:hAnsi="Times New Roman" w:cs="Times New Roman"/>
-          <w:sz w:val="24"/>
-          <w:szCs w:val="24"/>
-        </w:rPr>
-        <w:t xml:space="preserve"> </w:t>
-      </w:r>
-      <w:r>
-        <w:rPr>
-          <w:rFonts w:ascii="Times New Roman" w:hAnsi="Times New Roman" w:cs="Times New Roman"/>
-          <w:sz w:val="24"/>
-          <w:szCs w:val="24"/>
-        </w:rPr>
-        <w:t>d'utilisation</w:t>
-      </w:r>
-      <w:r>
-        <w:rPr>
-          <w:rFonts w:ascii="Times New Roman" w:hAnsi="Times New Roman" w:cs="Times New Roman"/>
-          <w:sz w:val="24"/>
-          <w:szCs w:val="24"/>
-        </w:rPr>
-        <w:t xml:space="preserve"> </w:t>
-      </w:r>
-      <w:r>
-        <w:rPr>
-          <w:rFonts w:ascii="Times New Roman" w:hAnsi="Times New Roman" w:cs="Times New Roman"/>
-          <w:sz w:val="24"/>
-          <w:szCs w:val="24"/>
-        </w:rPr>
-        <w:t>Gestion administrative et commercial</w:t>
-      </w:r>
-    </w:p>
-    <w:p>
-      <w:pPr>
         <w:tabs>
           <w:tab w:val="left" w:pos="5560"/>
         </w:tabs>
@@ -26639,63 +26718,6 @@
           <w:lang w:eastAsia="fr-FR"/>
         </w:rPr>
       </w:pPr>
-      <w:r>
-        <w:rPr>
-          <w:rFonts w:ascii="Times New Roman" w:hAnsi="Times New Roman" w:cs="Times New Roman"/>
-          <w:noProof/>
-          <w:sz w:val="24"/>
-          <w:szCs w:val="24"/>
-          <w:lang w:eastAsia="fr-FR"/>
-        </w:rPr>
-        <w:drawing>
-          <wp:inline distT="0" distB="0" distL="0" distR="0">
-            <wp:extent cx="5760720" cy="5053925"/>
-            <wp:effectExtent l="0" t="0" r="0" b="0"/>
-            <wp:docPr id="9" name="Image 9" descr="D:\l3\Memoire_De_Fin_Cycle\photo\receptionniste1.drawio.png"/>
-            <wp:cNvGraphicFramePr>
-              <a:graphicFrameLocks xmlns:a="http://schemas.openxmlformats.org/drawingml/2006/main" noChangeAspect="1"/>
-            </wp:cNvGraphicFramePr>
-            <a:graphic xmlns:a="http://schemas.openxmlformats.org/drawingml/2006/main">
-              <a:graphicData uri="http://schemas.openxmlformats.org/drawingml/2006/picture">
-                <pic:pic xmlns:pic="http://schemas.openxmlformats.org/drawingml/2006/picture">
-                  <pic:nvPicPr>
-                    <pic:cNvPr id="0" name="Picture 3" descr="D:\l3\Memoire_De_Fin_Cycle\photo\receptionniste1.drawio.png"/>
-                    <pic:cNvPicPr>
-                      <a:picLocks noChangeAspect="1" noChangeArrowheads="1"/>
-                    </pic:cNvPicPr>
-                  </pic:nvPicPr>
-                  <pic:blipFill>
-                    <a:blip r:embed="rId14">
-                      <a:extLst>
-                        <a:ext uri="{28A0092B-C50C-407E-A947-70E740481C1C}">
-                          <a14:useLocalDpi xmlns:a14="http://schemas.microsoft.com/office/drawing/2010/main" val="0"/>
-                        </a:ext>
-                      </a:extLst>
-                    </a:blip>
-                    <a:srcRect/>
-                    <a:stretch>
-                      <a:fillRect/>
-                    </a:stretch>
-                  </pic:blipFill>
-                  <pic:spPr bwMode="auto">
-                    <a:xfrm>
-                      <a:off x="0" y="0"/>
-                      <a:ext cx="5760720" cy="5053925"/>
-                    </a:xfrm>
-                    <a:prstGeom prst="rect">
-                      <a:avLst/>
-                    </a:prstGeom>
-                    <a:noFill/>
-                    <a:ln>
-                      <a:noFill/>
-                    </a:ln>
-                  </pic:spPr>
-                </pic:pic>
-              </a:graphicData>
-            </a:graphic>
-          </wp:inline>
-        </w:drawing>
-      </w:r>
     </w:p>
     <w:p>
       <w:pPr>
@@ -26959,7 +26981,6 @@
           <w:sz w:val="24"/>
           <w:szCs w:val="24"/>
         </w:rPr>
-        <w:lastRenderedPageBreak/>
         <w:t xml:space="preserve">Précondition : </w:t>
       </w:r>
       <w:r>
@@ -27376,6 +27397,7 @@
           <w:sz w:val="24"/>
           <w:szCs w:val="24"/>
         </w:rPr>
+        <w:lastRenderedPageBreak/>
         <w:t>Le système notifie le retour en atelier</w:t>
       </w:r>
     </w:p>
@@ -32667,11 +32689,11 @@
           <w:szCs w:val="24"/>
         </w:rPr>
       </w:pPr>
-      <w:bookmarkStart w:id="0" w:name="_Toc139051828"/>
-      <w:bookmarkStart w:id="1" w:name="_Toc139052710"/>
-      <w:bookmarkStart w:id="2" w:name="_Toc140167712"/>
-      <w:bookmarkStart w:id="3" w:name="_Toc140169869"/>
-      <w:bookmarkStart w:id="4" w:name="_Toc140514109"/>
+      <w:bookmarkStart w:id="1" w:name="_Toc139051828"/>
+      <w:bookmarkStart w:id="2" w:name="_Toc139052710"/>
+      <w:bookmarkStart w:id="3" w:name="_Toc140167712"/>
+      <w:bookmarkStart w:id="4" w:name="_Toc140169869"/>
+      <w:bookmarkStart w:id="5" w:name="_Toc140514109"/>
       <w:r>
         <w:rPr>
           <w:b w:val="0"/>
@@ -32680,11 +32702,11 @@
         </w:rPr>
         <w:t>Architecture de l’application</w:t>
       </w:r>
-      <w:bookmarkEnd w:id="0"/>
       <w:bookmarkEnd w:id="1"/>
       <w:bookmarkEnd w:id="2"/>
       <w:bookmarkEnd w:id="3"/>
       <w:bookmarkEnd w:id="4"/>
+      <w:bookmarkEnd w:id="5"/>
     </w:p>
     <w:p>
       <w:pPr>
@@ -34995,13 +35017,7 @@
           <w:b/>
         </w:rPr>
         <w:lastRenderedPageBreak/>
-        <w:t>Authentification des utilisateurs</w:t>
-      </w:r>
-      <w:r>
-        <w:rPr>
-          <w:b/>
-        </w:rPr>
-        <w:t xml:space="preserve"> </w:t>
+        <w:t xml:space="preserve">Authentification des utilisateurs </w:t>
       </w:r>
     </w:p>
     <w:p>
@@ -35079,19 +35095,7 @@
         <w:t>Les mots de passe des utilisateurs de l’application ne doivent jamais être enregistrés en clair dans la base de données. Laravel fournit un mécanisme de hachage permettant de protéger ces informations.</w:t>
       </w:r>
       <w:r>
-        <w:t xml:space="preserve"> </w:t>
-      </w:r>
-      <w:r>
-        <w:t xml:space="preserve">Lors de la création d’un compte, le mot de passe </w:t>
-      </w:r>
-      <w:r>
-        <w:t>peut-être</w:t>
-      </w:r>
-      <w:r>
-        <w:t xml:space="preserve"> haché avant son enregistrement</w:t>
-      </w:r>
-      <w:r>
-        <w:t>.</w:t>
+        <w:t xml:space="preserve"> Lors de la création d’un compte, le mot de passe peut-être haché avant son enregistrement.</w:t>
       </w:r>
     </w:p>
     <w:p>
@@ -35231,7 +35235,23 @@
         <w:spacing w:after="0" w:line="240" w:lineRule="auto"/>
       </w:pPr>
       <w:r>
-        <w:t>L’authentification seule ne suffit pas à garantir la sécurité de l’application. Il est également nécessaire de déterminer les fonctionnalités auxquelles chaque utilisateur peut accéder.</w:t>
+        <w:t xml:space="preserve">L’authentification seule ne suffit pas à garantir la sécurité de l’application. Il est également nécessaire de déterminer les fonctionnalités auxquelles chaque utilisateur peut accéder. </w:t>
+      </w:r>
+    </w:p>
+    <w:p>
+      <w:pPr>
+        <w:spacing w:after="0" w:line="240" w:lineRule="auto"/>
+      </w:pPr>
+      <w:r>
+        <w:t xml:space="preserve">Dans le contexte de Génération Automobile, plusieurs profils peuvent être envisagés, par exemple un administrateur, un responsable du garage ou un mécanicien. Chaque profil peut disposer de droits différents. </w:t>
+      </w:r>
+    </w:p>
+    <w:p>
+      <w:pPr>
+        <w:spacing w:after="0" w:line="240" w:lineRule="auto"/>
+      </w:pPr>
+      <w:r>
+        <w:t>L’administrateur peut, par exemple, gérer les comptes utilisateurs et l’ensemble des données du système, tandis qu’un mécanicien peut principalement consulter les interventions qui lui sont attribuées et mettre à jour leur état.</w:t>
       </w:r>
       <w:r>
         <w:t xml:space="preserve"> </w:t>
@@ -35240,28 +35260,6 @@
     <w:p>
       <w:pPr>
         <w:spacing w:after="0" w:line="240" w:lineRule="auto"/>
-      </w:pPr>
-      <w:r>
-        <w:t>Dans le contexte de Génération Automobile, plusieurs profils peuvent être envisagés, par exemple un administrateur, un responsable du garage ou un mécanicien. Chaque profil peut disposer de droits différents.</w:t>
-      </w:r>
-      <w:r>
-        <w:t xml:space="preserve"> </w:t>
-      </w:r>
-    </w:p>
-    <w:p>
-      <w:pPr>
-        <w:spacing w:after="0" w:line="240" w:lineRule="auto"/>
-      </w:pPr>
-      <w:r>
-        <w:t>L’administrateur peut, par exemple, gérer les comptes utilisateurs et l’ensemble des données du système, tandis qu’un mécanicien peut principalement consulter les interventions qui lui sont attribuées et mettre à jour leur état.</w:t>
-      </w:r>
-      <w:r>
-        <w:t xml:space="preserve"> </w:t>
-      </w:r>
-    </w:p>
-    <w:p>
-      <w:pPr>
-        <w:spacing w:after="0" w:line="240" w:lineRule="auto"/>
         <w:rPr>
           <w:rFonts w:ascii="Times New Roman" w:eastAsia="Times New Roman" w:hAnsi="Times New Roman" w:cs="Times New Roman"/>
           <w:sz w:val="24"/>
@@ -35269,8 +35267,6 @@
           <w:lang w:eastAsia="fr-FR"/>
         </w:rPr>
       </w:pPr>
-      <w:bookmarkStart w:id="5" w:name="_GoBack"/>
-      <w:bookmarkEnd w:id="5"/>
       <w:r>
         <w:t>Ainsi, avant de permettre la suppression d’une intervention ou la modification d’informations sensibles, l’application peut vérifier le rôle et les permissions de l’utilisateur connecté.</w:t>
       </w:r>
@@ -35400,7 +35396,7 @@
         <v:path o:extrusionok="f" gradientshapeok="t" o:connecttype="rect"/>
         <o:lock v:ext="edit" aspectratio="t"/>
       </v:shapetype>
-      <v:shape id="_x0000_i1077" type="#_x0000_t75" style="width:11.4pt;height:11.4pt" o:bullet="t">
+      <v:shape id="_x0000_i1029" type="#_x0000_t75" style="width:11.4pt;height:11.4pt" o:bullet="t">
         <v:imagedata r:id="rId1" o:title="mso3B8"/>
       </v:shape>
     </w:pict>
@@ -42045,7 +42041,7 @@
 </file>
 
 <file path=customXml/itemProps1.xml><?xml version="1.0" encoding="utf-8"?>
-<ds:datastoreItem xmlns:ds="http://schemas.openxmlformats.org/officeDocument/2006/customXml" ds:itemID="{0BBA8B25-5162-4B16-9D66-C398EB41019C}">
+<ds:datastoreItem xmlns:ds="http://schemas.openxmlformats.org/officeDocument/2006/customXml" ds:itemID="{49ABEF56-E91C-463A-B83F-285E7FB75030}">
   <ds:schemaRefs>
     <ds:schemaRef ds:uri="http://schemas.openxmlformats.org/officeDocument/2006/bibliography"/>
   </ds:schemaRefs>

</xml_diff>

<commit_message>
mis à jour diagramme
</commit_message>
<xml_diff>
--- a/projet_memoire.docx
+++ b/projet_memoire.docx
@@ -2048,6 +2048,8 @@
         </w:rPr>
         <w:t>contraintes financières et opérationnelles significatives</w:t>
       </w:r>
+      <w:bookmarkStart w:id="0" w:name="_GoBack"/>
+      <w:bookmarkEnd w:id="0"/>
       <w:r>
         <w:rPr>
           <w:rFonts w:ascii="Times New Roman" w:hAnsi="Times New Roman" w:cs="Times New Roman"/>
@@ -25642,10 +25644,10 @@
         </w:rPr>
         <w:lastRenderedPageBreak/>
         <w:drawing>
-          <wp:inline distT="0" distB="0" distL="0" distR="0" wp14:anchorId="03C83629" wp14:editId="32D26A3C">
-            <wp:extent cx="5760720" cy="5053330"/>
+          <wp:inline distT="0" distB="0" distL="0" distR="0">
+            <wp:extent cx="6142103" cy="5053330"/>
             <wp:effectExtent l="0" t="0" r="0" b="0"/>
-            <wp:docPr id="9" name="Image 9" descr="D:\l3\Memoire_De_Fin_Cycle\photo\receptionniste1.drawio.png"/>
+            <wp:docPr id="8" name="Image 8" descr="D:\l3\Memoire_De_Fin_Cycle\photo\cl.png"/>
             <wp:cNvGraphicFramePr>
               <a:graphicFrameLocks xmlns:a="http://schemas.openxmlformats.org/drawingml/2006/main" noChangeAspect="1"/>
             </wp:cNvGraphicFramePr>
@@ -25653,7 +25655,7 @@
               <a:graphicData uri="http://schemas.openxmlformats.org/drawingml/2006/picture">
                 <pic:pic xmlns:pic="http://schemas.openxmlformats.org/drawingml/2006/picture">
                   <pic:nvPicPr>
-                    <pic:cNvPr id="0" name="Picture 3" descr="D:\l3\Memoire_De_Fin_Cycle\photo\receptionniste1.drawio.png"/>
+                    <pic:cNvPr id="0" name="Picture 2" descr="D:\l3\Memoire_De_Fin_Cycle\photo\cl.png"/>
                     <pic:cNvPicPr>
                       <a:picLocks noChangeAspect="1" noChangeArrowheads="1"/>
                     </pic:cNvPicPr>
@@ -25674,7 +25676,7 @@
                   <pic:spPr bwMode="auto">
                     <a:xfrm>
                       <a:off x="0" y="0"/>
-                      <a:ext cx="5760720" cy="5053330"/>
+                      <a:ext cx="6144587" cy="5055374"/>
                     </a:xfrm>
                     <a:prstGeom prst="rect">
                       <a:avLst/>
@@ -25729,8 +25731,6 @@
           <w:szCs w:val="24"/>
         </w:rPr>
       </w:pPr>
-      <w:bookmarkStart w:id="0" w:name="_GoBack"/>
-      <w:bookmarkEnd w:id="0"/>
       <w:r>
         <w:rPr>
           <w:rFonts w:ascii="Times New Roman" w:hAnsi="Times New Roman" w:cs="Times New Roman"/>
@@ -26191,6 +26191,7 @@
         <w:tabs>
           <w:tab w:val="left" w:pos="5560"/>
         </w:tabs>
+        <w:spacing w:line="240" w:lineRule="auto"/>
         <w:ind w:left="360"/>
         <w:rPr>
           <w:rFonts w:ascii="Times New Roman" w:hAnsi="Times New Roman" w:cs="Times New Roman"/>
@@ -26206,6 +26207,431 @@
         </w:rPr>
         <w:t>Le client ouvre l'application</w:t>
       </w:r>
+    </w:p>
+    <w:p>
+      <w:pPr>
+        <w:tabs>
+          <w:tab w:val="left" w:pos="5560"/>
+        </w:tabs>
+        <w:spacing w:line="240" w:lineRule="auto"/>
+        <w:ind w:left="360"/>
+        <w:rPr>
+          <w:rFonts w:ascii="Times New Roman" w:hAnsi="Times New Roman" w:cs="Times New Roman"/>
+          <w:sz w:val="24"/>
+          <w:szCs w:val="24"/>
+        </w:rPr>
+      </w:pPr>
+      <w:r>
+        <w:rPr>
+          <w:rFonts w:ascii="Times New Roman" w:hAnsi="Times New Roman" w:cs="Times New Roman"/>
+          <w:sz w:val="24"/>
+          <w:szCs w:val="24"/>
+        </w:rPr>
+        <w:t>Le système affiche automatiquement les créneaux disponibles</w:t>
+      </w:r>
+    </w:p>
+    <w:p>
+      <w:pPr>
+        <w:tabs>
+          <w:tab w:val="left" w:pos="5560"/>
+        </w:tabs>
+        <w:spacing w:line="240" w:lineRule="auto"/>
+        <w:ind w:left="360"/>
+        <w:rPr>
+          <w:rFonts w:ascii="Times New Roman" w:hAnsi="Times New Roman" w:cs="Times New Roman"/>
+          <w:sz w:val="24"/>
+          <w:szCs w:val="24"/>
+        </w:rPr>
+      </w:pPr>
+      <w:r>
+        <w:rPr>
+          <w:rFonts w:ascii="Times New Roman" w:hAnsi="Times New Roman" w:cs="Times New Roman"/>
+          <w:sz w:val="24"/>
+          <w:szCs w:val="24"/>
+        </w:rPr>
+        <w:t>Le client sélectionne une date et une heure</w:t>
+      </w:r>
+    </w:p>
+    <w:p>
+      <w:pPr>
+        <w:tabs>
+          <w:tab w:val="left" w:pos="5560"/>
+        </w:tabs>
+        <w:spacing w:line="240" w:lineRule="auto"/>
+        <w:ind w:left="360"/>
+        <w:rPr>
+          <w:rFonts w:ascii="Times New Roman" w:hAnsi="Times New Roman" w:cs="Times New Roman"/>
+          <w:sz w:val="24"/>
+          <w:szCs w:val="24"/>
+        </w:rPr>
+      </w:pPr>
+      <w:r>
+        <w:rPr>
+          <w:rFonts w:ascii="Times New Roman" w:hAnsi="Times New Roman" w:cs="Times New Roman"/>
+          <w:sz w:val="24"/>
+          <w:szCs w:val="24"/>
+        </w:rPr>
+        <w:t>Le système lui demande de se connecter avant de continuer</w:t>
+      </w:r>
+    </w:p>
+    <w:p>
+      <w:pPr>
+        <w:tabs>
+          <w:tab w:val="left" w:pos="5560"/>
+        </w:tabs>
+        <w:spacing w:line="240" w:lineRule="auto"/>
+        <w:ind w:left="360"/>
+        <w:rPr>
+          <w:rFonts w:ascii="Times New Roman" w:hAnsi="Times New Roman" w:cs="Times New Roman"/>
+          <w:sz w:val="24"/>
+          <w:szCs w:val="24"/>
+        </w:rPr>
+      </w:pPr>
+      <w:r>
+        <w:rPr>
+          <w:rFonts w:ascii="Times New Roman" w:hAnsi="Times New Roman" w:cs="Times New Roman"/>
+          <w:sz w:val="24"/>
+          <w:szCs w:val="24"/>
+        </w:rPr>
+        <w:t>Si le client a déjà un compte :</w:t>
+      </w:r>
+    </w:p>
+    <w:p>
+      <w:pPr>
+        <w:tabs>
+          <w:tab w:val="left" w:pos="5560"/>
+        </w:tabs>
+        <w:spacing w:line="240" w:lineRule="auto"/>
+        <w:ind w:left="360"/>
+        <w:rPr>
+          <w:rFonts w:ascii="Times New Roman" w:hAnsi="Times New Roman" w:cs="Times New Roman"/>
+          <w:sz w:val="24"/>
+          <w:szCs w:val="24"/>
+        </w:rPr>
+      </w:pPr>
+      <w:r>
+        <w:rPr>
+          <w:rFonts w:ascii="Times New Roman" w:hAnsi="Times New Roman" w:cs="Times New Roman"/>
+          <w:sz w:val="24"/>
+          <w:szCs w:val="24"/>
+        </w:rPr>
+        <w:t>Il saisit son identifiant et son mot de passe</w:t>
+      </w:r>
+    </w:p>
+    <w:p>
+      <w:pPr>
+        <w:tabs>
+          <w:tab w:val="left" w:pos="5560"/>
+        </w:tabs>
+        <w:spacing w:line="240" w:lineRule="auto"/>
+        <w:ind w:left="360"/>
+        <w:rPr>
+          <w:rFonts w:ascii="Times New Roman" w:hAnsi="Times New Roman" w:cs="Times New Roman"/>
+          <w:sz w:val="24"/>
+          <w:szCs w:val="24"/>
+        </w:rPr>
+      </w:pPr>
+      <w:r>
+        <w:rPr>
+          <w:rFonts w:ascii="Times New Roman" w:hAnsi="Times New Roman" w:cs="Times New Roman"/>
+          <w:sz w:val="24"/>
+          <w:szCs w:val="24"/>
+        </w:rPr>
+        <w:t>Le système lui accorde l'accès</w:t>
+      </w:r>
+    </w:p>
+    <w:p>
+      <w:pPr>
+        <w:tabs>
+          <w:tab w:val="left" w:pos="5560"/>
+        </w:tabs>
+        <w:spacing w:line="240" w:lineRule="auto"/>
+        <w:ind w:left="360"/>
+        <w:rPr>
+          <w:rFonts w:ascii="Times New Roman" w:hAnsi="Times New Roman" w:cs="Times New Roman"/>
+          <w:sz w:val="24"/>
+          <w:szCs w:val="24"/>
+        </w:rPr>
+      </w:pPr>
+      <w:r>
+        <w:rPr>
+          <w:rFonts w:ascii="Times New Roman" w:hAnsi="Times New Roman" w:cs="Times New Roman"/>
+          <w:sz w:val="24"/>
+          <w:szCs w:val="24"/>
+        </w:rPr>
+        <w:t>Si le client n'a pas de compte :</w:t>
+      </w:r>
+    </w:p>
+    <w:p>
+      <w:pPr>
+        <w:tabs>
+          <w:tab w:val="left" w:pos="5560"/>
+        </w:tabs>
+        <w:spacing w:line="240" w:lineRule="auto"/>
+        <w:ind w:left="360"/>
+        <w:rPr>
+          <w:rFonts w:ascii="Times New Roman" w:hAnsi="Times New Roman" w:cs="Times New Roman"/>
+          <w:sz w:val="24"/>
+          <w:szCs w:val="24"/>
+        </w:rPr>
+      </w:pPr>
+      <w:r>
+        <w:rPr>
+          <w:rFonts w:ascii="Times New Roman" w:hAnsi="Times New Roman" w:cs="Times New Roman"/>
+          <w:sz w:val="24"/>
+          <w:szCs w:val="24"/>
+        </w:rPr>
+        <w:t>Il crée un nouveau compte avec ses informations</w:t>
+      </w:r>
+    </w:p>
+    <w:p>
+      <w:pPr>
+        <w:tabs>
+          <w:tab w:val="left" w:pos="5560"/>
+        </w:tabs>
+        <w:spacing w:line="240" w:lineRule="auto"/>
+        <w:ind w:left="360"/>
+        <w:rPr>
+          <w:rFonts w:ascii="Times New Roman" w:hAnsi="Times New Roman" w:cs="Times New Roman"/>
+          <w:sz w:val="24"/>
+          <w:szCs w:val="24"/>
+        </w:rPr>
+      </w:pPr>
+      <w:r>
+        <w:rPr>
+          <w:rFonts w:ascii="Times New Roman" w:hAnsi="Times New Roman" w:cs="Times New Roman"/>
+          <w:sz w:val="24"/>
+          <w:szCs w:val="24"/>
+        </w:rPr>
+        <w:t>Le système confirme la création du compte</w:t>
+      </w:r>
+    </w:p>
+    <w:p>
+      <w:pPr>
+        <w:tabs>
+          <w:tab w:val="left" w:pos="5560"/>
+        </w:tabs>
+        <w:spacing w:line="240" w:lineRule="auto"/>
+        <w:ind w:left="360"/>
+        <w:rPr>
+          <w:rFonts w:ascii="Times New Roman" w:hAnsi="Times New Roman" w:cs="Times New Roman"/>
+          <w:sz w:val="24"/>
+          <w:szCs w:val="24"/>
+        </w:rPr>
+      </w:pPr>
+      <w:r>
+        <w:rPr>
+          <w:rFonts w:ascii="Times New Roman" w:hAnsi="Times New Roman" w:cs="Times New Roman"/>
+          <w:sz w:val="24"/>
+          <w:szCs w:val="24"/>
+        </w:rPr>
+        <w:t>Le client se connecte avec ses nouveaux identifiants</w:t>
+      </w:r>
+    </w:p>
+    <w:p>
+      <w:pPr>
+        <w:tabs>
+          <w:tab w:val="left" w:pos="5560"/>
+        </w:tabs>
+        <w:spacing w:line="240" w:lineRule="auto"/>
+        <w:ind w:left="360"/>
+        <w:rPr>
+          <w:rFonts w:ascii="Times New Roman" w:hAnsi="Times New Roman" w:cs="Times New Roman"/>
+          <w:sz w:val="24"/>
+          <w:szCs w:val="24"/>
+        </w:rPr>
+      </w:pPr>
+      <w:r>
+        <w:rPr>
+          <w:rFonts w:ascii="Times New Roman" w:hAnsi="Times New Roman" w:cs="Times New Roman"/>
+          <w:sz w:val="24"/>
+          <w:szCs w:val="24"/>
+        </w:rPr>
+        <w:t>Le système lui accorde l'accès</w:t>
+      </w:r>
+    </w:p>
+    <w:p>
+      <w:pPr>
+        <w:tabs>
+          <w:tab w:val="left" w:pos="5560"/>
+        </w:tabs>
+        <w:spacing w:line="240" w:lineRule="auto"/>
+        <w:ind w:left="360"/>
+        <w:rPr>
+          <w:rFonts w:ascii="Times New Roman" w:hAnsi="Times New Roman" w:cs="Times New Roman"/>
+          <w:sz w:val="24"/>
+          <w:szCs w:val="24"/>
+        </w:rPr>
+      </w:pPr>
+      <w:r>
+        <w:rPr>
+          <w:rFonts w:ascii="Times New Roman" w:hAnsi="Times New Roman" w:cs="Times New Roman"/>
+          <w:sz w:val="24"/>
+          <w:szCs w:val="24"/>
+        </w:rPr>
+        <w:t>Le client confirme son rendez-vous</w:t>
+      </w:r>
+    </w:p>
+    <w:p>
+      <w:pPr>
+        <w:spacing w:line="240" w:lineRule="auto"/>
+        <w:ind w:firstLine="360"/>
+        <w:rPr>
+          <w:rFonts w:ascii="Times New Roman" w:eastAsia="Times New Roman" w:hAnsi="Times New Roman" w:cs="Times New Roman"/>
+          <w:sz w:val="24"/>
+          <w:szCs w:val="24"/>
+          <w:lang w:eastAsia="fr-FR"/>
+        </w:rPr>
+      </w:pPr>
+      <w:r>
+        <w:rPr>
+          <w:rFonts w:ascii="Times New Roman" w:eastAsia="Times New Roman" w:hAnsi="Times New Roman" w:cs="Times New Roman"/>
+          <w:bCs/>
+          <w:sz w:val="24"/>
+          <w:szCs w:val="24"/>
+          <w:lang w:eastAsia="fr-FR"/>
+        </w:rPr>
+        <w:t>Si le créneau est disponible :</w:t>
+      </w:r>
+    </w:p>
+    <w:p>
+      <w:pPr>
+        <w:spacing w:line="240" w:lineRule="auto"/>
+        <w:ind w:firstLine="360"/>
+        <w:rPr>
+          <w:rFonts w:ascii="Times New Roman" w:eastAsia="Times New Roman" w:hAnsi="Times New Roman" w:cs="Times New Roman"/>
+          <w:sz w:val="24"/>
+          <w:szCs w:val="24"/>
+          <w:lang w:eastAsia="fr-FR"/>
+        </w:rPr>
+      </w:pPr>
+      <w:r>
+        <w:rPr>
+          <w:rFonts w:ascii="Times New Roman" w:eastAsia="Times New Roman" w:hAnsi="Times New Roman" w:cs="Times New Roman"/>
+          <w:sz w:val="24"/>
+          <w:szCs w:val="24"/>
+          <w:lang w:eastAsia="fr-FR"/>
+        </w:rPr>
+        <w:t>Le système affiche la confirmation du rendez-vous</w:t>
+      </w:r>
+    </w:p>
+    <w:p>
+      <w:pPr>
+        <w:spacing w:line="240" w:lineRule="auto"/>
+        <w:ind w:firstLine="360"/>
+        <w:rPr>
+          <w:rFonts w:ascii="Times New Roman" w:eastAsia="Times New Roman" w:hAnsi="Times New Roman" w:cs="Times New Roman"/>
+          <w:sz w:val="24"/>
+          <w:szCs w:val="24"/>
+          <w:lang w:eastAsia="fr-FR"/>
+        </w:rPr>
+      </w:pPr>
+      <w:r>
+        <w:rPr>
+          <w:rFonts w:ascii="Times New Roman" w:eastAsia="Times New Roman" w:hAnsi="Times New Roman" w:cs="Times New Roman"/>
+          <w:sz w:val="24"/>
+          <w:szCs w:val="24"/>
+          <w:lang w:eastAsia="fr-FR"/>
+        </w:rPr>
+        <w:t>Le système envoie une confirmation par email au client</w:t>
+      </w:r>
+    </w:p>
+    <w:p>
+      <w:pPr>
+        <w:spacing w:line="240" w:lineRule="auto"/>
+        <w:ind w:firstLine="360"/>
+        <w:rPr>
+          <w:rFonts w:ascii="Times New Roman" w:eastAsia="Times New Roman" w:hAnsi="Times New Roman" w:cs="Times New Roman"/>
+          <w:sz w:val="24"/>
+          <w:szCs w:val="24"/>
+          <w:lang w:eastAsia="fr-FR"/>
+        </w:rPr>
+      </w:pPr>
+      <w:r>
+        <w:rPr>
+          <w:rFonts w:ascii="Times New Roman" w:eastAsia="Times New Roman" w:hAnsi="Times New Roman" w:cs="Times New Roman"/>
+          <w:bCs/>
+          <w:sz w:val="24"/>
+          <w:szCs w:val="24"/>
+          <w:lang w:eastAsia="fr-FR"/>
+        </w:rPr>
+        <w:t>Si le créneau n'est plus disponible :</w:t>
+      </w:r>
+    </w:p>
+    <w:p>
+      <w:pPr>
+        <w:spacing w:line="240" w:lineRule="auto"/>
+        <w:ind w:firstLine="360"/>
+        <w:rPr>
+          <w:rFonts w:ascii="Times New Roman" w:eastAsia="Times New Roman" w:hAnsi="Times New Roman" w:cs="Times New Roman"/>
+          <w:sz w:val="24"/>
+          <w:szCs w:val="24"/>
+          <w:lang w:eastAsia="fr-FR"/>
+        </w:rPr>
+      </w:pPr>
+      <w:r>
+        <w:rPr>
+          <w:rFonts w:ascii="Times New Roman" w:eastAsia="Times New Roman" w:hAnsi="Times New Roman" w:cs="Times New Roman"/>
+          <w:sz w:val="24"/>
+          <w:szCs w:val="24"/>
+          <w:lang w:eastAsia="fr-FR"/>
+        </w:rPr>
+        <w:t>Le système informe le client que le créneau est pris</w:t>
+      </w:r>
+    </w:p>
+    <w:p>
+      <w:pPr>
+        <w:spacing w:line="240" w:lineRule="auto"/>
+        <w:ind w:firstLine="360"/>
+        <w:rPr>
+          <w:rFonts w:ascii="Times New Roman" w:eastAsia="Times New Roman" w:hAnsi="Times New Roman" w:cs="Times New Roman"/>
+          <w:sz w:val="24"/>
+          <w:szCs w:val="24"/>
+          <w:lang w:eastAsia="fr-FR"/>
+        </w:rPr>
+      </w:pPr>
+      <w:r>
+        <w:rPr>
+          <w:rFonts w:ascii="Times New Roman" w:eastAsia="Times New Roman" w:hAnsi="Times New Roman" w:cs="Times New Roman"/>
+          <w:sz w:val="24"/>
+          <w:szCs w:val="24"/>
+          <w:lang w:eastAsia="fr-FR"/>
+        </w:rPr>
+        <w:t>Le système propose un autre créneau disponible</w:t>
+      </w:r>
+    </w:p>
+    <w:p>
+      <w:pPr>
+        <w:spacing w:line="240" w:lineRule="auto"/>
+        <w:ind w:firstLine="360"/>
+        <w:rPr>
+          <w:rFonts w:ascii="Times New Roman" w:eastAsia="Times New Roman" w:hAnsi="Times New Roman" w:cs="Times New Roman"/>
+          <w:sz w:val="24"/>
+          <w:szCs w:val="24"/>
+          <w:lang w:eastAsia="fr-FR"/>
+        </w:rPr>
+      </w:pPr>
+      <w:r>
+        <w:rPr>
+          <w:rFonts w:ascii="Times New Roman" w:eastAsia="Times New Roman" w:hAnsi="Times New Roman" w:cs="Times New Roman"/>
+          <w:sz w:val="24"/>
+          <w:szCs w:val="24"/>
+          <w:lang w:eastAsia="fr-FR"/>
+        </w:rPr>
+        <w:t>Le client recommence la sélection</w:t>
+      </w:r>
+    </w:p>
+    <w:p>
+      <w:pPr>
+        <w:spacing w:before="100" w:beforeAutospacing="1" w:after="100" w:afterAutospacing="1" w:line="240" w:lineRule="auto"/>
+        <w:ind w:firstLine="360"/>
+        <w:rPr>
+          <w:rFonts w:ascii="Times New Roman" w:eastAsia="Times New Roman" w:hAnsi="Times New Roman" w:cs="Times New Roman"/>
+          <w:sz w:val="24"/>
+          <w:szCs w:val="24"/>
+          <w:lang w:eastAsia="fr-FR"/>
+        </w:rPr>
+      </w:pPr>
     </w:p>
     <w:p>
       <w:pPr>
@@ -26215,426 +26641,15 @@
         <w:ind w:left="360"/>
         <w:rPr>
           <w:rFonts w:ascii="Times New Roman" w:hAnsi="Times New Roman" w:cs="Times New Roman"/>
-          <w:sz w:val="24"/>
-          <w:szCs w:val="24"/>
-        </w:rPr>
-      </w:pPr>
-      <w:r>
-        <w:rPr>
-          <w:rFonts w:ascii="Times New Roman" w:hAnsi="Times New Roman" w:cs="Times New Roman"/>
-          <w:sz w:val="24"/>
-          <w:szCs w:val="24"/>
-        </w:rPr>
-        <w:t>Le système affiche automatiquement les créneaux disponibles</w:t>
-      </w:r>
-    </w:p>
-    <w:p>
-      <w:pPr>
-        <w:tabs>
-          <w:tab w:val="left" w:pos="5560"/>
-        </w:tabs>
-        <w:ind w:left="360"/>
-        <w:rPr>
-          <w:rFonts w:ascii="Times New Roman" w:hAnsi="Times New Roman" w:cs="Times New Roman"/>
-          <w:sz w:val="24"/>
-          <w:szCs w:val="24"/>
-        </w:rPr>
-      </w:pPr>
-      <w:r>
-        <w:rPr>
-          <w:rFonts w:ascii="Times New Roman" w:hAnsi="Times New Roman" w:cs="Times New Roman"/>
-          <w:sz w:val="24"/>
-          <w:szCs w:val="24"/>
-        </w:rPr>
-        <w:t>Le client sélectionne une date et une heure</w:t>
-      </w:r>
-    </w:p>
-    <w:p>
-      <w:pPr>
-        <w:tabs>
-          <w:tab w:val="left" w:pos="5560"/>
-        </w:tabs>
-        <w:ind w:left="360"/>
-        <w:rPr>
-          <w:rFonts w:ascii="Times New Roman" w:hAnsi="Times New Roman" w:cs="Times New Roman"/>
-          <w:sz w:val="24"/>
-          <w:szCs w:val="24"/>
-        </w:rPr>
-      </w:pPr>
-      <w:r>
-        <w:rPr>
-          <w:rFonts w:ascii="Times New Roman" w:hAnsi="Times New Roman" w:cs="Times New Roman"/>
-          <w:sz w:val="24"/>
-          <w:szCs w:val="24"/>
-        </w:rPr>
-        <w:t>Le système lui demande de se connecter avant de continuer</w:t>
-      </w:r>
-    </w:p>
-    <w:p>
-      <w:pPr>
-        <w:tabs>
-          <w:tab w:val="left" w:pos="5560"/>
-        </w:tabs>
-        <w:ind w:left="360"/>
-        <w:rPr>
-          <w:rFonts w:ascii="Times New Roman" w:hAnsi="Times New Roman" w:cs="Times New Roman"/>
-          <w:sz w:val="24"/>
-          <w:szCs w:val="24"/>
-        </w:rPr>
-      </w:pPr>
-      <w:r>
-        <w:rPr>
-          <w:rFonts w:ascii="Times New Roman" w:hAnsi="Times New Roman" w:cs="Times New Roman"/>
-          <w:sz w:val="24"/>
-          <w:szCs w:val="24"/>
-        </w:rPr>
-        <w:t>Si le client a déjà un compte :</w:t>
-      </w:r>
-    </w:p>
-    <w:p>
-      <w:pPr>
-        <w:tabs>
-          <w:tab w:val="left" w:pos="5560"/>
-        </w:tabs>
-        <w:ind w:left="360"/>
-        <w:rPr>
-          <w:rFonts w:ascii="Times New Roman" w:hAnsi="Times New Roman" w:cs="Times New Roman"/>
-          <w:sz w:val="24"/>
-          <w:szCs w:val="24"/>
-        </w:rPr>
-      </w:pPr>
-      <w:r>
-        <w:rPr>
-          <w:rFonts w:ascii="Times New Roman" w:hAnsi="Times New Roman" w:cs="Times New Roman"/>
-          <w:sz w:val="24"/>
-          <w:szCs w:val="24"/>
-        </w:rPr>
-        <w:t>Il saisit son identifiant et son mot de passe</w:t>
-      </w:r>
-    </w:p>
-    <w:p>
-      <w:pPr>
-        <w:tabs>
-          <w:tab w:val="left" w:pos="5560"/>
-        </w:tabs>
-        <w:ind w:left="360"/>
-        <w:rPr>
-          <w:rFonts w:ascii="Times New Roman" w:hAnsi="Times New Roman" w:cs="Times New Roman"/>
-          <w:sz w:val="24"/>
-          <w:szCs w:val="24"/>
-        </w:rPr>
-      </w:pPr>
-      <w:r>
-        <w:rPr>
-          <w:rFonts w:ascii="Times New Roman" w:hAnsi="Times New Roman" w:cs="Times New Roman"/>
-          <w:sz w:val="24"/>
-          <w:szCs w:val="24"/>
-        </w:rPr>
-        <w:t>Le système lui accorde l'accès</w:t>
-      </w:r>
-    </w:p>
-    <w:p>
-      <w:pPr>
-        <w:tabs>
-          <w:tab w:val="left" w:pos="5560"/>
-        </w:tabs>
-        <w:ind w:left="360"/>
-        <w:rPr>
-          <w:rFonts w:ascii="Times New Roman" w:hAnsi="Times New Roman" w:cs="Times New Roman"/>
-          <w:sz w:val="24"/>
-          <w:szCs w:val="24"/>
-        </w:rPr>
-      </w:pPr>
-      <w:r>
-        <w:rPr>
-          <w:rFonts w:ascii="Times New Roman" w:hAnsi="Times New Roman" w:cs="Times New Roman"/>
-          <w:sz w:val="24"/>
-          <w:szCs w:val="24"/>
-        </w:rPr>
-        <w:t>Si le client n'a pas de compte :</w:t>
-      </w:r>
-    </w:p>
-    <w:p>
-      <w:pPr>
-        <w:tabs>
-          <w:tab w:val="left" w:pos="5560"/>
-        </w:tabs>
-        <w:ind w:left="360"/>
-        <w:rPr>
-          <w:rFonts w:ascii="Times New Roman" w:hAnsi="Times New Roman" w:cs="Times New Roman"/>
-          <w:sz w:val="24"/>
-          <w:szCs w:val="24"/>
-        </w:rPr>
-      </w:pPr>
-      <w:r>
-        <w:rPr>
-          <w:rFonts w:ascii="Times New Roman" w:hAnsi="Times New Roman" w:cs="Times New Roman"/>
-          <w:sz w:val="24"/>
-          <w:szCs w:val="24"/>
-        </w:rPr>
-        <w:t>Il crée un nouveau compte avec ses informations</w:t>
-      </w:r>
-    </w:p>
-    <w:p>
-      <w:pPr>
-        <w:tabs>
-          <w:tab w:val="left" w:pos="5560"/>
-        </w:tabs>
-        <w:ind w:left="360"/>
-        <w:rPr>
-          <w:rFonts w:ascii="Times New Roman" w:hAnsi="Times New Roman" w:cs="Times New Roman"/>
-          <w:sz w:val="24"/>
-          <w:szCs w:val="24"/>
-        </w:rPr>
-      </w:pPr>
-      <w:r>
-        <w:rPr>
-          <w:rFonts w:ascii="Times New Roman" w:hAnsi="Times New Roman" w:cs="Times New Roman"/>
-          <w:sz w:val="24"/>
-          <w:szCs w:val="24"/>
-        </w:rPr>
-        <w:t>Le système confirme la création du compte</w:t>
-      </w:r>
-    </w:p>
-    <w:p>
-      <w:pPr>
-        <w:tabs>
-          <w:tab w:val="left" w:pos="5560"/>
-        </w:tabs>
-        <w:ind w:left="360"/>
-        <w:rPr>
-          <w:rFonts w:ascii="Times New Roman" w:hAnsi="Times New Roman" w:cs="Times New Roman"/>
-          <w:sz w:val="24"/>
-          <w:szCs w:val="24"/>
-        </w:rPr>
-      </w:pPr>
-      <w:r>
-        <w:rPr>
-          <w:rFonts w:ascii="Times New Roman" w:hAnsi="Times New Roman" w:cs="Times New Roman"/>
-          <w:sz w:val="24"/>
-          <w:szCs w:val="24"/>
-        </w:rPr>
-        <w:t>Le client se connecte avec ses nouveaux identifiants</w:t>
-      </w:r>
-    </w:p>
-    <w:p>
-      <w:pPr>
-        <w:tabs>
-          <w:tab w:val="left" w:pos="5560"/>
-        </w:tabs>
-        <w:ind w:left="360"/>
-        <w:rPr>
-          <w:rFonts w:ascii="Times New Roman" w:hAnsi="Times New Roman" w:cs="Times New Roman"/>
-          <w:sz w:val="24"/>
-          <w:szCs w:val="24"/>
-        </w:rPr>
-      </w:pPr>
-      <w:r>
-        <w:rPr>
-          <w:rFonts w:ascii="Times New Roman" w:hAnsi="Times New Roman" w:cs="Times New Roman"/>
-          <w:sz w:val="24"/>
-          <w:szCs w:val="24"/>
-        </w:rPr>
-        <w:t>Le système lui accorde l'accès</w:t>
-      </w:r>
-    </w:p>
-    <w:p>
-      <w:pPr>
-        <w:tabs>
-          <w:tab w:val="left" w:pos="5560"/>
-        </w:tabs>
-        <w:ind w:left="360"/>
-        <w:rPr>
-          <w:rFonts w:ascii="Times New Roman" w:hAnsi="Times New Roman" w:cs="Times New Roman"/>
-          <w:sz w:val="24"/>
-          <w:szCs w:val="24"/>
-        </w:rPr>
-      </w:pPr>
-      <w:r>
-        <w:rPr>
-          <w:rFonts w:ascii="Times New Roman" w:hAnsi="Times New Roman" w:cs="Times New Roman"/>
-          <w:sz w:val="24"/>
-          <w:szCs w:val="24"/>
-        </w:rPr>
-        <w:t>Le client confirme son rendez-vous</w:t>
-      </w:r>
-    </w:p>
-    <w:p>
-      <w:pPr>
-        <w:spacing w:before="100" w:beforeAutospacing="1" w:after="100" w:afterAutospacing="1" w:line="240" w:lineRule="auto"/>
-        <w:ind w:firstLine="360"/>
-        <w:rPr>
-          <w:rFonts w:ascii="Times New Roman" w:eastAsia="Times New Roman" w:hAnsi="Times New Roman" w:cs="Times New Roman"/>
-          <w:sz w:val="24"/>
-          <w:szCs w:val="24"/>
-          <w:lang w:eastAsia="fr-FR"/>
-        </w:rPr>
-      </w:pPr>
-      <w:r>
-        <w:rPr>
-          <w:rFonts w:ascii="Times New Roman" w:eastAsia="Times New Roman" w:hAnsi="Times New Roman" w:cs="Times New Roman"/>
-          <w:bCs/>
-          <w:sz w:val="24"/>
-          <w:szCs w:val="24"/>
-          <w:lang w:eastAsia="fr-FR"/>
-        </w:rPr>
-        <w:t>Si le créneau est disponible :</w:t>
-      </w:r>
-    </w:p>
-    <w:p>
-      <w:pPr>
-        <w:spacing w:before="100" w:beforeAutospacing="1" w:after="100" w:afterAutospacing="1" w:line="240" w:lineRule="auto"/>
-        <w:ind w:firstLine="360"/>
-        <w:rPr>
-          <w:rFonts w:ascii="Times New Roman" w:eastAsia="Times New Roman" w:hAnsi="Times New Roman" w:cs="Times New Roman"/>
-          <w:sz w:val="24"/>
-          <w:szCs w:val="24"/>
-          <w:lang w:eastAsia="fr-FR"/>
-        </w:rPr>
-      </w:pPr>
-      <w:r>
-        <w:rPr>
-          <w:rFonts w:ascii="Times New Roman" w:eastAsia="Times New Roman" w:hAnsi="Times New Roman" w:cs="Times New Roman"/>
-          <w:sz w:val="24"/>
-          <w:szCs w:val="24"/>
-          <w:lang w:eastAsia="fr-FR"/>
-        </w:rPr>
-        <w:t>Le système affiche la confirmation du rendez-vous</w:t>
-      </w:r>
-    </w:p>
-    <w:p>
-      <w:pPr>
-        <w:spacing w:before="100" w:beforeAutospacing="1" w:after="100" w:afterAutospacing="1" w:line="240" w:lineRule="auto"/>
-        <w:ind w:firstLine="360"/>
-        <w:rPr>
-          <w:rFonts w:ascii="Times New Roman" w:eastAsia="Times New Roman" w:hAnsi="Times New Roman" w:cs="Times New Roman"/>
-          <w:sz w:val="24"/>
-          <w:szCs w:val="24"/>
-          <w:lang w:eastAsia="fr-FR"/>
-        </w:rPr>
-      </w:pPr>
-      <w:r>
-        <w:rPr>
-          <w:rFonts w:ascii="Times New Roman" w:eastAsia="Times New Roman" w:hAnsi="Times New Roman" w:cs="Times New Roman"/>
-          <w:sz w:val="24"/>
-          <w:szCs w:val="24"/>
-          <w:lang w:eastAsia="fr-FR"/>
-        </w:rPr>
-        <w:t>Le système envoie une confirmation par email au client</w:t>
-      </w:r>
-    </w:p>
-    <w:p>
-      <w:pPr>
-        <w:spacing w:before="100" w:beforeAutospacing="1" w:after="100" w:afterAutospacing="1" w:line="240" w:lineRule="auto"/>
-        <w:ind w:firstLine="360"/>
-        <w:rPr>
-          <w:rFonts w:ascii="Times New Roman" w:eastAsia="Times New Roman" w:hAnsi="Times New Roman" w:cs="Times New Roman"/>
-          <w:sz w:val="24"/>
-          <w:szCs w:val="24"/>
-          <w:lang w:eastAsia="fr-FR"/>
-        </w:rPr>
-      </w:pPr>
-      <w:r>
-        <w:rPr>
-          <w:rFonts w:ascii="Times New Roman" w:eastAsia="Times New Roman" w:hAnsi="Times New Roman" w:cs="Times New Roman"/>
-          <w:bCs/>
-          <w:sz w:val="24"/>
-          <w:szCs w:val="24"/>
-          <w:lang w:eastAsia="fr-FR"/>
-        </w:rPr>
-        <w:t>Si le créneau n'est plus disponible :</w:t>
-      </w:r>
-    </w:p>
-    <w:p>
-      <w:pPr>
-        <w:spacing w:before="100" w:beforeAutospacing="1" w:after="100" w:afterAutospacing="1" w:line="240" w:lineRule="auto"/>
-        <w:ind w:firstLine="360"/>
-        <w:rPr>
-          <w:rFonts w:ascii="Times New Roman" w:eastAsia="Times New Roman" w:hAnsi="Times New Roman" w:cs="Times New Roman"/>
-          <w:sz w:val="24"/>
-          <w:szCs w:val="24"/>
-          <w:lang w:eastAsia="fr-FR"/>
-        </w:rPr>
-      </w:pPr>
-      <w:r>
-        <w:rPr>
-          <w:rFonts w:ascii="Times New Roman" w:eastAsia="Times New Roman" w:hAnsi="Times New Roman" w:cs="Times New Roman"/>
-          <w:sz w:val="24"/>
-          <w:szCs w:val="24"/>
-          <w:lang w:eastAsia="fr-FR"/>
-        </w:rPr>
-        <w:t>Le système informe le client que le créneau est pris</w:t>
-      </w:r>
-    </w:p>
-    <w:p>
-      <w:pPr>
-        <w:spacing w:before="100" w:beforeAutospacing="1" w:after="100" w:afterAutospacing="1" w:line="240" w:lineRule="auto"/>
-        <w:ind w:firstLine="360"/>
-        <w:rPr>
-          <w:rFonts w:ascii="Times New Roman" w:eastAsia="Times New Roman" w:hAnsi="Times New Roman" w:cs="Times New Roman"/>
-          <w:sz w:val="24"/>
-          <w:szCs w:val="24"/>
-          <w:lang w:eastAsia="fr-FR"/>
-        </w:rPr>
-      </w:pPr>
-      <w:r>
-        <w:rPr>
-          <w:rFonts w:ascii="Times New Roman" w:eastAsia="Times New Roman" w:hAnsi="Times New Roman" w:cs="Times New Roman"/>
-          <w:sz w:val="24"/>
-          <w:szCs w:val="24"/>
-          <w:lang w:eastAsia="fr-FR"/>
-        </w:rPr>
-        <w:t>Le système propose un autre créneau disponible</w:t>
-      </w:r>
-    </w:p>
-    <w:p>
-      <w:pPr>
-        <w:spacing w:before="100" w:beforeAutospacing="1" w:after="100" w:afterAutospacing="1" w:line="240" w:lineRule="auto"/>
-        <w:ind w:firstLine="360"/>
-        <w:rPr>
-          <w:rFonts w:ascii="Times New Roman" w:eastAsia="Times New Roman" w:hAnsi="Times New Roman" w:cs="Times New Roman"/>
-          <w:sz w:val="24"/>
-          <w:szCs w:val="24"/>
-          <w:lang w:eastAsia="fr-FR"/>
-        </w:rPr>
-      </w:pPr>
-      <w:r>
-        <w:rPr>
-          <w:rFonts w:ascii="Times New Roman" w:eastAsia="Times New Roman" w:hAnsi="Times New Roman" w:cs="Times New Roman"/>
-          <w:sz w:val="24"/>
-          <w:szCs w:val="24"/>
-          <w:lang w:eastAsia="fr-FR"/>
-        </w:rPr>
-        <w:lastRenderedPageBreak/>
-        <w:t>Le client recommence la sélection</w:t>
-      </w:r>
-    </w:p>
-    <w:p>
-      <w:pPr>
-        <w:spacing w:before="100" w:beforeAutospacing="1" w:after="100" w:afterAutospacing="1" w:line="240" w:lineRule="auto"/>
-        <w:ind w:firstLine="360"/>
-        <w:rPr>
-          <w:rFonts w:ascii="Times New Roman" w:eastAsia="Times New Roman" w:hAnsi="Times New Roman" w:cs="Times New Roman"/>
-          <w:sz w:val="24"/>
-          <w:szCs w:val="24"/>
-          <w:lang w:eastAsia="fr-FR"/>
-        </w:rPr>
-      </w:pPr>
-    </w:p>
-    <w:p>
-      <w:pPr>
-        <w:spacing w:before="100" w:beforeAutospacing="1" w:after="100" w:afterAutospacing="1" w:line="240" w:lineRule="auto"/>
-        <w:ind w:firstLine="360"/>
-        <w:rPr>
-          <w:rFonts w:ascii="Times New Roman" w:eastAsia="Times New Roman" w:hAnsi="Times New Roman" w:cs="Times New Roman"/>
-          <w:sz w:val="24"/>
-          <w:szCs w:val="24"/>
-          <w:lang w:eastAsia="fr-FR"/>
-        </w:rPr>
-      </w:pPr>
-      <w:r>
-        <w:rPr>
-          <w:rFonts w:ascii="Times New Roman" w:eastAsia="Times New Roman" w:hAnsi="Times New Roman" w:cs="Times New Roman"/>
+          <w:noProof/>
+          <w:sz w:val="24"/>
+          <w:szCs w:val="24"/>
+          <w:lang w:eastAsia="fr-FR"/>
+        </w:rPr>
+      </w:pPr>
+      <w:r>
+        <w:rPr>
+          <w:rFonts w:ascii="Times New Roman" w:hAnsi="Times New Roman" w:cs="Times New Roman"/>
           <w:noProof/>
           <w:sz w:val="24"/>
           <w:szCs w:val="24"/>
@@ -26643,9 +26658,9 @@
         <w:lastRenderedPageBreak/>
         <w:drawing>
           <wp:inline distT="0" distB="0" distL="0" distR="0">
-            <wp:extent cx="5324475" cy="9248140"/>
-            <wp:effectExtent l="0" t="0" r="9525" b="0"/>
-            <wp:docPr id="11" name="Image 11" descr="D:\l3\Memoire_De_Fin_Cycle\photo\clie.png"/>
+            <wp:extent cx="5457190" cy="8892540"/>
+            <wp:effectExtent l="0" t="0" r="0" b="3810"/>
+            <wp:docPr id="20" name="Image 20"/>
             <wp:cNvGraphicFramePr>
               <a:graphicFrameLocks xmlns:a="http://schemas.openxmlformats.org/drawingml/2006/main" noChangeAspect="1"/>
             </wp:cNvGraphicFramePr>
@@ -26653,10 +26668,8 @@
               <a:graphicData uri="http://schemas.openxmlformats.org/drawingml/2006/picture">
                 <pic:pic xmlns:pic="http://schemas.openxmlformats.org/drawingml/2006/picture">
                   <pic:nvPicPr>
-                    <pic:cNvPr id="0" name="Picture 5" descr="D:\l3\Memoire_De_Fin_Cycle\photo\clie.png"/>
-                    <pic:cNvPicPr>
-                      <a:picLocks noChangeAspect="1" noChangeArrowheads="1"/>
-                    </pic:cNvPicPr>
+                    <pic:cNvPr id="20" name="clavecA.png"/>
+                    <pic:cNvPicPr/>
                   </pic:nvPicPr>
                   <pic:blipFill>
                     <a:blip r:embed="rId14">
@@ -26666,23 +26679,18 @@
                         </a:ext>
                       </a:extLst>
                     </a:blip>
-                    <a:srcRect/>
                     <a:stretch>
                       <a:fillRect/>
                     </a:stretch>
                   </pic:blipFill>
-                  <pic:spPr bwMode="auto">
+                  <pic:spPr>
                     <a:xfrm>
                       <a:off x="0" y="0"/>
-                      <a:ext cx="5324475" cy="9248140"/>
+                      <a:ext cx="5457190" cy="8892540"/>
                     </a:xfrm>
                     <a:prstGeom prst="rect">
                       <a:avLst/>
                     </a:prstGeom>
-                    <a:noFill/>
-                    <a:ln>
-                      <a:noFill/>
-                    </a:ln>
                   </pic:spPr>
                 </pic:pic>
               </a:graphicData>
@@ -26699,8 +26707,10 @@
         <w:ind w:left="360"/>
         <w:rPr>
           <w:rFonts w:ascii="Times New Roman" w:hAnsi="Times New Roman" w:cs="Times New Roman"/>
-          <w:sz w:val="24"/>
-          <w:szCs w:val="24"/>
+          <w:noProof/>
+          <w:sz w:val="24"/>
+          <w:szCs w:val="24"/>
+          <w:lang w:eastAsia="fr-FR"/>
         </w:rPr>
       </w:pPr>
     </w:p>
@@ -26712,10 +26722,8 @@
         <w:ind w:left="360"/>
         <w:rPr>
           <w:rFonts w:ascii="Times New Roman" w:hAnsi="Times New Roman" w:cs="Times New Roman"/>
-          <w:noProof/>
-          <w:sz w:val="24"/>
-          <w:szCs w:val="24"/>
-          <w:lang w:eastAsia="fr-FR"/>
+          <w:sz w:val="24"/>
+          <w:szCs w:val="24"/>
         </w:rPr>
       </w:pPr>
     </w:p>
@@ -26727,12 +26735,50 @@
         <w:ind w:left="360"/>
         <w:rPr>
           <w:rFonts w:ascii="Times New Roman" w:hAnsi="Times New Roman" w:cs="Times New Roman"/>
-          <w:noProof/>
-          <w:sz w:val="24"/>
-          <w:szCs w:val="24"/>
-          <w:lang w:eastAsia="fr-FR"/>
-        </w:rPr>
-      </w:pPr>
+          <w:sz w:val="24"/>
+          <w:szCs w:val="24"/>
+        </w:rPr>
+      </w:pPr>
+      <w:r>
+        <w:rPr>
+          <w:rFonts w:ascii="Times New Roman" w:hAnsi="Times New Roman" w:cs="Times New Roman"/>
+          <w:sz w:val="24"/>
+          <w:szCs w:val="24"/>
+        </w:rPr>
+        <w:t xml:space="preserve">Diagramme de Séquence de </w:t>
+      </w:r>
+      <w:r>
+        <w:rPr>
+          <w:rFonts w:ascii="Times New Roman" w:hAnsi="Times New Roman" w:cs="Times New Roman"/>
+          <w:sz w:val="24"/>
+          <w:szCs w:val="24"/>
+        </w:rPr>
+        <w:t>Créer ordre</w:t>
+      </w:r>
+      <w:r>
+        <w:rPr>
+          <w:rFonts w:ascii="Times New Roman" w:hAnsi="Times New Roman" w:cs="Times New Roman"/>
+          <w:sz w:val="24"/>
+          <w:szCs w:val="24"/>
+        </w:rPr>
+        <w:t xml:space="preserve"> </w:t>
+      </w:r>
+      <w:r>
+        <w:rPr>
+          <w:rFonts w:ascii="Times New Roman" w:hAnsi="Times New Roman" w:cs="Times New Roman"/>
+          <w:sz w:val="24"/>
+          <w:szCs w:val="24"/>
+        </w:rPr>
+        <w:t>d’</w:t>
+      </w:r>
+      <w:r>
+        <w:rPr>
+          <w:rFonts w:ascii="Times New Roman" w:hAnsi="Times New Roman" w:cs="Times New Roman"/>
+          <w:sz w:val="24"/>
+          <w:szCs w:val="24"/>
+        </w:rPr>
+        <w:t>intervention</w:t>
+      </w:r>
     </w:p>
     <w:p>
       <w:pPr>
@@ -26765,15 +26811,7 @@
           <w:sz w:val="24"/>
           <w:szCs w:val="24"/>
         </w:rPr>
-        <w:t xml:space="preserve">Diagramme de Séquence de Gérer </w:t>
-      </w:r>
-      <w:r>
-        <w:rPr>
-          <w:rFonts w:ascii="Times New Roman" w:hAnsi="Times New Roman" w:cs="Times New Roman"/>
-          <w:sz w:val="24"/>
-          <w:szCs w:val="24"/>
-        </w:rPr>
-        <w:t>cycle intervention</w:t>
+        <w:t>Description :</w:t>
       </w:r>
     </w:p>
     <w:p>
@@ -26788,6 +26826,14 @@
           <w:szCs w:val="24"/>
         </w:rPr>
       </w:pPr>
+      <w:r>
+        <w:rPr>
+          <w:rFonts w:ascii="Times New Roman" w:hAnsi="Times New Roman" w:cs="Times New Roman"/>
+          <w:sz w:val="24"/>
+          <w:szCs w:val="24"/>
+        </w:rPr>
+        <w:t>Premier Partie : Identification</w:t>
+      </w:r>
     </w:p>
     <w:p>
       <w:pPr>
@@ -26807,7 +26853,7 @@
           <w:sz w:val="24"/>
           <w:szCs w:val="24"/>
         </w:rPr>
-        <w:t>Description :</w:t>
+        <w:t>Nom : Gérer cycle intervention</w:t>
       </w:r>
     </w:p>
     <w:p>
@@ -26828,7 +26874,7 @@
           <w:sz w:val="24"/>
           <w:szCs w:val="24"/>
         </w:rPr>
-        <w:t>Premier Partie : Identification</w:t>
+        <w:t xml:space="preserve">Acteur : réceptionniste </w:t>
       </w:r>
     </w:p>
     <w:p>
@@ -26849,7 +26895,55 @@
           <w:sz w:val="24"/>
           <w:szCs w:val="24"/>
         </w:rPr>
-        <w:t>Nom : Gérer cycle intervention</w:t>
+        <w:t xml:space="preserve">Objectif : </w:t>
+      </w:r>
+      <w:r>
+        <w:rPr>
+          <w:rFonts w:ascii="Times New Roman" w:hAnsi="Times New Roman" w:cs="Times New Roman"/>
+          <w:sz w:val="24"/>
+          <w:szCs w:val="24"/>
+        </w:rPr>
+        <w:t>p</w:t>
+      </w:r>
+      <w:r>
+        <w:rPr>
+          <w:rFonts w:ascii="Times New Roman" w:hAnsi="Times New Roman" w:cs="Times New Roman"/>
+          <w:sz w:val="24"/>
+          <w:szCs w:val="24"/>
+        </w:rPr>
+        <w:t>e</w:t>
+      </w:r>
+      <w:r>
+        <w:rPr>
+          <w:rFonts w:ascii="Times New Roman" w:hAnsi="Times New Roman" w:cs="Times New Roman"/>
+          <w:sz w:val="24"/>
+          <w:szCs w:val="24"/>
+        </w:rPr>
+        <w:t>rmet au</w:t>
+      </w:r>
+      <w:r>
+        <w:rPr>
+          <w:rFonts w:ascii="Times New Roman" w:hAnsi="Times New Roman" w:cs="Times New Roman"/>
+          <w:sz w:val="24"/>
+          <w:szCs w:val="24"/>
+        </w:rPr>
+        <w:t xml:space="preserve"> </w:t>
+      </w:r>
+      <w:r>
+        <w:rPr>
+          <w:rFonts w:ascii="Times New Roman" w:hAnsi="Times New Roman" w:cs="Times New Roman"/>
+          <w:sz w:val="24"/>
+          <w:szCs w:val="24"/>
+        </w:rPr>
+        <w:t xml:space="preserve">réceptionniste </w:t>
+      </w:r>
+      <w:r>
+        <w:rPr>
+          <w:rFonts w:ascii="Times New Roman" w:hAnsi="Times New Roman" w:cs="Times New Roman"/>
+          <w:sz w:val="24"/>
+          <w:szCs w:val="24"/>
+        </w:rPr>
+        <w:t>de créer une intervention, de la suivre jusqu’à la génération d’une facture.</w:t>
       </w:r>
     </w:p>
     <w:p>
@@ -26870,7 +26964,7 @@
           <w:sz w:val="24"/>
           <w:szCs w:val="24"/>
         </w:rPr>
-        <w:t xml:space="preserve">Acteur : réceptionniste </w:t>
+        <w:t>Deuxième partie : Description Scenario</w:t>
       </w:r>
     </w:p>
     <w:p>
@@ -26891,55 +26985,45 @@
           <w:sz w:val="24"/>
           <w:szCs w:val="24"/>
         </w:rPr>
-        <w:t xml:space="preserve">Objectif : </w:t>
-      </w:r>
-      <w:r>
-        <w:rPr>
-          <w:rFonts w:ascii="Times New Roman" w:hAnsi="Times New Roman" w:cs="Times New Roman"/>
-          <w:sz w:val="24"/>
-          <w:szCs w:val="24"/>
-        </w:rPr>
-        <w:t>p</w:t>
-      </w:r>
-      <w:r>
-        <w:rPr>
-          <w:rFonts w:ascii="Times New Roman" w:hAnsi="Times New Roman" w:cs="Times New Roman"/>
-          <w:sz w:val="24"/>
-          <w:szCs w:val="24"/>
-        </w:rPr>
-        <w:t>e</w:t>
-      </w:r>
-      <w:r>
-        <w:rPr>
-          <w:rFonts w:ascii="Times New Roman" w:hAnsi="Times New Roman" w:cs="Times New Roman"/>
-          <w:sz w:val="24"/>
-          <w:szCs w:val="24"/>
-        </w:rPr>
-        <w:t>rmet au</w:t>
-      </w:r>
-      <w:r>
-        <w:rPr>
-          <w:rFonts w:ascii="Times New Roman" w:hAnsi="Times New Roman" w:cs="Times New Roman"/>
-          <w:sz w:val="24"/>
-          <w:szCs w:val="24"/>
-        </w:rPr>
-        <w:t xml:space="preserve"> </w:t>
-      </w:r>
-      <w:r>
-        <w:rPr>
-          <w:rFonts w:ascii="Times New Roman" w:hAnsi="Times New Roman" w:cs="Times New Roman"/>
-          <w:sz w:val="24"/>
-          <w:szCs w:val="24"/>
-        </w:rPr>
-        <w:t xml:space="preserve">réceptionniste </w:t>
-      </w:r>
-      <w:r>
-        <w:rPr>
-          <w:rFonts w:ascii="Times New Roman" w:hAnsi="Times New Roman" w:cs="Times New Roman"/>
-          <w:sz w:val="24"/>
-          <w:szCs w:val="24"/>
-        </w:rPr>
-        <w:t>de créer une intervention, de la suivre jusqu’à la génération d’une facture.</w:t>
+        <w:t xml:space="preserve">Précondition : </w:t>
+      </w:r>
+      <w:r>
+        <w:rPr>
+          <w:sz w:val="24"/>
+          <w:szCs w:val="24"/>
+        </w:rPr>
+        <w:t xml:space="preserve">le système doit garantir un état de </w:t>
+      </w:r>
+      <w:r>
+        <w:rPr>
+          <w:bCs/>
+          <w:sz w:val="24"/>
+          <w:szCs w:val="24"/>
+        </w:rPr>
+        <w:t>disponibilité immédiate</w:t>
+      </w:r>
+      <w:r>
+        <w:rPr>
+          <w:sz w:val="24"/>
+          <w:szCs w:val="24"/>
+        </w:rPr>
+        <w:t xml:space="preserve"> et de </w:t>
+      </w:r>
+      <w:r>
+        <w:rPr>
+          <w:bCs/>
+          <w:sz w:val="24"/>
+          <w:szCs w:val="24"/>
+        </w:rPr>
+        <w:t>sécurité</w:t>
+      </w:r>
+      <w:r>
+        <w:rPr>
+          <w:rFonts w:ascii="Times New Roman" w:hAnsi="Times New Roman" w:cs="Times New Roman"/>
+          <w:sz w:val="24"/>
+          <w:szCs w:val="24"/>
+        </w:rPr>
+        <w:t xml:space="preserve">. </w:t>
       </w:r>
     </w:p>
     <w:p>
@@ -26960,7 +27044,7 @@
           <w:sz w:val="24"/>
           <w:szCs w:val="24"/>
         </w:rPr>
-        <w:t>Deuxième partie : Description Scenario</w:t>
+        <w:t>L’enchainement des messages :</w:t>
       </w:r>
     </w:p>
     <w:p>
@@ -26981,45 +27065,7 @@
           <w:sz w:val="24"/>
           <w:szCs w:val="24"/>
         </w:rPr>
-        <w:t xml:space="preserve">Précondition : </w:t>
-      </w:r>
-      <w:r>
-        <w:rPr>
-          <w:sz w:val="24"/>
-          <w:szCs w:val="24"/>
-        </w:rPr>
-        <w:t xml:space="preserve">le système doit garantir un état de </w:t>
-      </w:r>
-      <w:r>
-        <w:rPr>
-          <w:bCs/>
-          <w:sz w:val="24"/>
-          <w:szCs w:val="24"/>
-        </w:rPr>
-        <w:t>disponibilité immédiate</w:t>
-      </w:r>
-      <w:r>
-        <w:rPr>
-          <w:sz w:val="24"/>
-          <w:szCs w:val="24"/>
-        </w:rPr>
-        <w:t xml:space="preserve"> et de </w:t>
-      </w:r>
-      <w:r>
-        <w:rPr>
-          <w:bCs/>
-          <w:sz w:val="24"/>
-          <w:szCs w:val="24"/>
-        </w:rPr>
-        <w:t>sécurité</w:t>
-      </w:r>
-      <w:r>
-        <w:rPr>
-          <w:rFonts w:ascii="Times New Roman" w:hAnsi="Times New Roman" w:cs="Times New Roman"/>
-          <w:sz w:val="24"/>
-          <w:szCs w:val="24"/>
-        </w:rPr>
-        <w:t xml:space="preserve">. </w:t>
+        <w:t>Le réceptionniste saisit ses identifiants</w:t>
       </w:r>
     </w:p>
     <w:p>
@@ -27040,7 +27086,7 @@
           <w:sz w:val="24"/>
           <w:szCs w:val="24"/>
         </w:rPr>
-        <w:t>L’enchainement des messages :</w:t>
+        <w:t>Le système lui accorde l'accès</w:t>
       </w:r>
     </w:p>
     <w:p>
@@ -27061,7 +27107,7 @@
           <w:sz w:val="24"/>
           <w:szCs w:val="24"/>
         </w:rPr>
-        <w:t>Le réceptionniste saisit ses identifiants</w:t>
+        <w:t>Le réceptionniste recherche le client et son véhicule</w:t>
       </w:r>
     </w:p>
     <w:p>
@@ -27082,7 +27128,7 @@
           <w:sz w:val="24"/>
           <w:szCs w:val="24"/>
         </w:rPr>
-        <w:t>Le système lui accorde l'accès</w:t>
+        <w:t>Le système affiche la fiche client</w:t>
       </w:r>
     </w:p>
     <w:p>
@@ -27103,7 +27149,7 @@
           <w:sz w:val="24"/>
           <w:szCs w:val="24"/>
         </w:rPr>
-        <w:t>Le réceptionniste recherche le client et son véhicule</w:t>
+        <w:t>Le réceptionniste crée l'ordre d'intervention</w:t>
       </w:r>
     </w:p>
     <w:p>
@@ -27124,7 +27170,7 @@
           <w:sz w:val="24"/>
           <w:szCs w:val="24"/>
         </w:rPr>
-        <w:t>Le système affiche la fiche client</w:t>
+        <w:t>Le système confirme la création avec un numéro d'ordre</w:t>
       </w:r>
     </w:p>
     <w:p>
@@ -27145,7 +27191,7 @@
           <w:sz w:val="24"/>
           <w:szCs w:val="24"/>
         </w:rPr>
-        <w:t>Le réceptionniste crée l'ordre d'intervention</w:t>
+        <w:t>Le réceptionniste affecte l'ordre au département concerné</w:t>
       </w:r>
     </w:p>
     <w:p>
@@ -27166,7 +27212,7 @@
           <w:sz w:val="24"/>
           <w:szCs w:val="24"/>
         </w:rPr>
-        <w:t>Le système confirme la création avec un numéro d'ordre</w:t>
+        <w:t>Le système confirme l'affectation</w:t>
       </w:r>
     </w:p>
     <w:p>
@@ -27187,7 +27233,7 @@
           <w:sz w:val="24"/>
           <w:szCs w:val="24"/>
         </w:rPr>
-        <w:t>Le réceptionniste affecte l'ordre au département concerné</w:t>
+        <w:t>Le réceptionniste consulte l'avancement</w:t>
       </w:r>
     </w:p>
     <w:p>
@@ -27208,7 +27254,7 @@
           <w:sz w:val="24"/>
           <w:szCs w:val="24"/>
         </w:rPr>
-        <w:t>Le système confirme l'affectation</w:t>
+        <w:t>Le système affiche le statut actuel</w:t>
       </w:r>
     </w:p>
     <w:p>
@@ -27229,7 +27275,7 @@
           <w:sz w:val="24"/>
           <w:szCs w:val="24"/>
         </w:rPr>
-        <w:t>Le réceptionniste consulte l'avancement</w:t>
+        <w:t>Le réceptionniste met à jour le statut</w:t>
       </w:r>
     </w:p>
     <w:p>
@@ -27250,7 +27296,7 @@
           <w:sz w:val="24"/>
           <w:szCs w:val="24"/>
         </w:rPr>
-        <w:t>Le système affiche le statut actuel</w:t>
+        <w:t>Le système confirme la mise à jour</w:t>
       </w:r>
     </w:p>
     <w:p>
@@ -27271,7 +27317,7 @@
           <w:sz w:val="24"/>
           <w:szCs w:val="24"/>
         </w:rPr>
-        <w:t>Le réceptionniste met à jour le statut</w:t>
+        <w:t>Si les essais sont validés :</w:t>
       </w:r>
     </w:p>
     <w:p>
@@ -27292,7 +27338,7 @@
           <w:sz w:val="24"/>
           <w:szCs w:val="24"/>
         </w:rPr>
-        <w:t>Le système confirme la mise à jour</w:t>
+        <w:t>Le réceptionniste clôture l'intervention</w:t>
       </w:r>
     </w:p>
     <w:p>
@@ -27313,7 +27359,7 @@
           <w:sz w:val="24"/>
           <w:szCs w:val="24"/>
         </w:rPr>
-        <w:t>Si les essais sont validés :</w:t>
+        <w:t>Le système confirme la clôture</w:t>
       </w:r>
     </w:p>
     <w:p>
@@ -27334,7 +27380,7 @@
           <w:sz w:val="24"/>
           <w:szCs w:val="24"/>
         </w:rPr>
-        <w:t>Le réceptionniste clôture l'intervention</w:t>
+        <w:t>Si retour en atelier :</w:t>
       </w:r>
     </w:p>
     <w:p>
@@ -27355,7 +27401,7 @@
           <w:sz w:val="24"/>
           <w:szCs w:val="24"/>
         </w:rPr>
-        <w:t>Le système confirme la clôture</w:t>
+        <w:t>Le système notifie le retour en atelier</w:t>
       </w:r>
     </w:p>
     <w:p>
@@ -27376,7 +27422,7 @@
           <w:sz w:val="24"/>
           <w:szCs w:val="24"/>
         </w:rPr>
-        <w:t>Si retour en atelier :</w:t>
+        <w:t>Le réceptionniste met à jour le statut</w:t>
       </w:r>
     </w:p>
     <w:p>
@@ -27398,7 +27444,7 @@
           <w:szCs w:val="24"/>
         </w:rPr>
         <w:lastRenderedPageBreak/>
-        <w:t>Le système notifie le retour en atelier</w:t>
+        <w:t>Le cycle de suivi recommence</w:t>
       </w:r>
     </w:p>
     <w:p>
@@ -27413,14 +27459,6 @@
           <w:szCs w:val="24"/>
         </w:rPr>
       </w:pPr>
-      <w:r>
-        <w:rPr>
-          <w:rFonts w:ascii="Times New Roman" w:hAnsi="Times New Roman" w:cs="Times New Roman"/>
-          <w:sz w:val="24"/>
-          <w:szCs w:val="24"/>
-        </w:rPr>
-        <w:t>Le réceptionniste met à jour le statut</w:t>
-      </w:r>
     </w:p>
     <w:p>
       <w:pPr>
@@ -27437,40 +27475,6 @@
       <w:r>
         <w:rPr>
           <w:rFonts w:ascii="Times New Roman" w:hAnsi="Times New Roman" w:cs="Times New Roman"/>
-          <w:sz w:val="24"/>
-          <w:szCs w:val="24"/>
-        </w:rPr>
-        <w:t>Le cycle de suivi recommence</w:t>
-      </w:r>
-    </w:p>
-    <w:p>
-      <w:pPr>
-        <w:tabs>
-          <w:tab w:val="left" w:pos="5560"/>
-        </w:tabs>
-        <w:ind w:left="360"/>
-        <w:rPr>
-          <w:rFonts w:ascii="Times New Roman" w:hAnsi="Times New Roman" w:cs="Times New Roman"/>
-          <w:sz w:val="24"/>
-          <w:szCs w:val="24"/>
-        </w:rPr>
-      </w:pPr>
-    </w:p>
-    <w:p>
-      <w:pPr>
-        <w:tabs>
-          <w:tab w:val="left" w:pos="5560"/>
-        </w:tabs>
-        <w:ind w:left="360"/>
-        <w:rPr>
-          <w:rFonts w:ascii="Times New Roman" w:hAnsi="Times New Roman" w:cs="Times New Roman"/>
-          <w:sz w:val="24"/>
-          <w:szCs w:val="24"/>
-        </w:rPr>
-      </w:pPr>
-      <w:r>
-        <w:rPr>
-          <w:rFonts w:ascii="Times New Roman" w:hAnsi="Times New Roman" w:cs="Times New Roman"/>
           <w:noProof/>
           <w:sz w:val="24"/>
           <w:szCs w:val="24"/>
@@ -27479,9 +27483,9 @@
         <w:lastRenderedPageBreak/>
         <w:drawing>
           <wp:inline distT="0" distB="0" distL="0" distR="0">
-            <wp:extent cx="5370187" cy="9212033"/>
-            <wp:effectExtent l="0" t="0" r="2540" b="8255"/>
-            <wp:docPr id="14" name="Image 14" descr="D:\l3\Memoire_De_Fin_Cycle\photo\rect.png"/>
+            <wp:extent cx="5213350" cy="8892540"/>
+            <wp:effectExtent l="0" t="0" r="6350" b="3810"/>
+            <wp:docPr id="24" name="Image 24"/>
             <wp:cNvGraphicFramePr>
               <a:graphicFrameLocks xmlns:a="http://schemas.openxmlformats.org/drawingml/2006/main" noChangeAspect="1"/>
             </wp:cNvGraphicFramePr>
@@ -27489,10 +27493,8 @@
               <a:graphicData uri="http://schemas.openxmlformats.org/drawingml/2006/picture">
                 <pic:pic xmlns:pic="http://schemas.openxmlformats.org/drawingml/2006/picture">
                   <pic:nvPicPr>
-                    <pic:cNvPr id="0" name="Picture 7" descr="D:\l3\Memoire_De_Fin_Cycle\photo\rect.png"/>
-                    <pic:cNvPicPr>
-                      <a:picLocks noChangeAspect="1" noChangeArrowheads="1"/>
-                    </pic:cNvPicPr>
+                    <pic:cNvPr id="24" name="recpaAut.png"/>
+                    <pic:cNvPicPr/>
                   </pic:nvPicPr>
                   <pic:blipFill>
                     <a:blip r:embed="rId15">
@@ -27502,23 +27504,18 @@
                         </a:ext>
                       </a:extLst>
                     </a:blip>
-                    <a:srcRect/>
                     <a:stretch>
                       <a:fillRect/>
                     </a:stretch>
                   </pic:blipFill>
-                  <pic:spPr bwMode="auto">
+                  <pic:spPr>
                     <a:xfrm>
                       <a:off x="0" y="0"/>
-                      <a:ext cx="5375327" cy="9220849"/>
+                      <a:ext cx="5213350" cy="8892540"/>
                     </a:xfrm>
                     <a:prstGeom prst="rect">
                       <a:avLst/>
                     </a:prstGeom>
-                    <a:noFill/>
-                    <a:ln>
-                      <a:noFill/>
-                    </a:ln>
                   </pic:spPr>
                 </pic:pic>
               </a:graphicData>
@@ -27594,7 +27591,15 @@
           <w:sz w:val="24"/>
           <w:szCs w:val="24"/>
         </w:rPr>
-        <w:t>Gestion des Interventions</w:t>
+        <w:t>Superviser</w:t>
+      </w:r>
+      <w:r>
+        <w:rPr>
+          <w:rFonts w:ascii="Times New Roman" w:hAnsi="Times New Roman" w:cs="Times New Roman"/>
+          <w:sz w:val="24"/>
+          <w:szCs w:val="24"/>
+        </w:rPr>
+        <w:t xml:space="preserve"> Interventions</w:t>
       </w:r>
     </w:p>
     <w:p>
@@ -27619,9 +27624,9 @@
         </w:rPr>
         <w:drawing>
           <wp:inline distT="0" distB="0" distL="0" distR="0">
-            <wp:extent cx="5760720" cy="4927055"/>
-            <wp:effectExtent l="0" t="0" r="0" b="6985"/>
-            <wp:docPr id="5" name="Image 5" descr="D:\l3\Memoire_De_Fin_Cycle\photo\chef de departement1.drawio.png"/>
+            <wp:extent cx="5435600" cy="8255000"/>
+            <wp:effectExtent l="0" t="0" r="0" b="0"/>
+            <wp:docPr id="25" name="Image 25"/>
             <wp:cNvGraphicFramePr>
               <a:graphicFrameLocks xmlns:a="http://schemas.openxmlformats.org/drawingml/2006/main" noChangeAspect="1"/>
             </wp:cNvGraphicFramePr>
@@ -27629,10 +27634,8 @@
               <a:graphicData uri="http://schemas.openxmlformats.org/drawingml/2006/picture">
                 <pic:pic xmlns:pic="http://schemas.openxmlformats.org/drawingml/2006/picture">
                   <pic:nvPicPr>
-                    <pic:cNvPr id="0" name="Picture 2" descr="D:\l3\Memoire_De_Fin_Cycle\photo\chef de departement1.drawio.png"/>
-                    <pic:cNvPicPr>
-                      <a:picLocks noChangeAspect="1" noChangeArrowheads="1"/>
-                    </pic:cNvPicPr>
+                    <pic:cNvPr id="25" name="chefDep.png"/>
+                    <pic:cNvPicPr/>
                   </pic:nvPicPr>
                   <pic:blipFill>
                     <a:blip r:embed="rId16">
@@ -27642,23 +27645,18 @@
                         </a:ext>
                       </a:extLst>
                     </a:blip>
-                    <a:srcRect/>
                     <a:stretch>
                       <a:fillRect/>
                     </a:stretch>
                   </pic:blipFill>
-                  <pic:spPr bwMode="auto">
+                  <pic:spPr>
                     <a:xfrm>
                       <a:off x="0" y="0"/>
-                      <a:ext cx="5760720" cy="4927055"/>
+                      <a:ext cx="5435600" cy="8255000"/>
                     </a:xfrm>
                     <a:prstGeom prst="rect">
                       <a:avLst/>
                     </a:prstGeom>
-                    <a:noFill/>
-                    <a:ln>
-                      <a:noFill/>
-                    </a:ln>
                   </pic:spPr>
                 </pic:pic>
               </a:graphicData>
@@ -27822,7 +27820,6 @@
         <w:ind w:left="360"/>
       </w:pPr>
       <w:r>
-        <w:lastRenderedPageBreak/>
         <w:t>Le chef contrôle l'avancement des travaux</w:t>
       </w:r>
     </w:p>
@@ -27900,78 +27897,10 @@
         <w:ind w:left="360"/>
       </w:pPr>
       <w:r>
-        <w:t>Le chef termine la supervision en marquant l'intervention comme terminée</w:t>
-      </w:r>
-    </w:p>
-    <w:p>
-      <w:pPr>
-        <w:tabs>
-          <w:tab w:val="left" w:pos="5560"/>
-        </w:tabs>
-        <w:ind w:left="360"/>
-      </w:pPr>
-    </w:p>
-    <w:p>
-      <w:pPr>
-        <w:tabs>
-          <w:tab w:val="left" w:pos="5560"/>
-        </w:tabs>
-        <w:ind w:left="360"/>
-      </w:pPr>
-      <w:r>
-        <w:rPr>
-          <w:noProof/>
-          <w:lang w:eastAsia="fr-FR"/>
-        </w:rPr>
-        <w:lastRenderedPageBreak/>
-        <w:drawing>
-          <wp:inline distT="0" distB="0" distL="0" distR="0">
-            <wp:extent cx="5579110" cy="8409305"/>
-            <wp:effectExtent l="0" t="0" r="2540" b="0"/>
-            <wp:docPr id="15" name="Image 15" descr="D:\l3\Memoire_De_Fin_Cycle\photo\cdpt.png"/>
-            <wp:cNvGraphicFramePr>
-              <a:graphicFrameLocks xmlns:a="http://schemas.openxmlformats.org/drawingml/2006/main" noChangeAspect="1"/>
-            </wp:cNvGraphicFramePr>
-            <a:graphic xmlns:a="http://schemas.openxmlformats.org/drawingml/2006/main">
-              <a:graphicData uri="http://schemas.openxmlformats.org/drawingml/2006/picture">
-                <pic:pic xmlns:pic="http://schemas.openxmlformats.org/drawingml/2006/picture">
-                  <pic:nvPicPr>
-                    <pic:cNvPr id="0" name="Picture 8" descr="D:\l3\Memoire_De_Fin_Cycle\photo\cdpt.png"/>
-                    <pic:cNvPicPr>
-                      <a:picLocks noChangeAspect="1" noChangeArrowheads="1"/>
-                    </pic:cNvPicPr>
-                  </pic:nvPicPr>
-                  <pic:blipFill>
-                    <a:blip r:embed="rId17">
-                      <a:extLst>
-                        <a:ext uri="{28A0092B-C50C-407E-A947-70E740481C1C}">
-                          <a14:useLocalDpi xmlns:a14="http://schemas.microsoft.com/office/drawing/2010/main" val="0"/>
-                        </a:ext>
-                      </a:extLst>
-                    </a:blip>
-                    <a:srcRect/>
-                    <a:stretch>
-                      <a:fillRect/>
-                    </a:stretch>
-                  </pic:blipFill>
-                  <pic:spPr bwMode="auto">
-                    <a:xfrm>
-                      <a:off x="0" y="0"/>
-                      <a:ext cx="5579110" cy="8409305"/>
-                    </a:xfrm>
-                    <a:prstGeom prst="rect">
-                      <a:avLst/>
-                    </a:prstGeom>
-                    <a:noFill/>
-                    <a:ln>
-                      <a:noFill/>
-                    </a:ln>
-                  </pic:spPr>
-                </pic:pic>
-              </a:graphicData>
-            </a:graphic>
-          </wp:inline>
-        </w:drawing>
+        <w:t>Le chef termine la supervision en marquan</w:t>
+      </w:r>
+      <w:r>
+        <w:t>t l'intervention comme terminée</w:t>
       </w:r>
     </w:p>
     <w:p>
@@ -28009,7 +27938,6 @@
           <w:sz w:val="24"/>
           <w:szCs w:val="24"/>
         </w:rPr>
-        <w:lastRenderedPageBreak/>
         <w:t>Diagramme de cas</w:t>
       </w:r>
       <w:r>
@@ -28065,6 +27993,7 @@
           <w:szCs w:val="24"/>
           <w:lang w:eastAsia="fr-FR"/>
         </w:rPr>
+        <w:lastRenderedPageBreak/>
         <w:drawing>
           <wp:inline distT="0" distB="0" distL="0" distR="0">
             <wp:extent cx="5760720" cy="3996944"/>
@@ -28083,7 +28012,7 @@
                     </pic:cNvPicPr>
                   </pic:nvPicPr>
                   <pic:blipFill>
-                    <a:blip r:embed="rId18">
+                    <a:blip r:embed="rId17">
                       <a:extLst>
                         <a:ext uri="{28A0092B-C50C-407E-A947-70E740481C1C}">
                           <a14:useLocalDpi xmlns:a14="http://schemas.microsoft.com/office/drawing/2010/main" val="0"/>
@@ -28308,7 +28237,6 @@
         <w:ind w:left="360"/>
       </w:pPr>
       <w:r>
-        <w:lastRenderedPageBreak/>
         <w:t>Il valide les essais</w:t>
       </w:r>
     </w:p>
@@ -28331,6 +28259,7 @@
         <w:ind w:left="360"/>
       </w:pPr>
       <w:r>
+        <w:lastRenderedPageBreak/>
         <w:t>Il autorise la facturation</w:t>
       </w:r>
     </w:p>
@@ -28480,9 +28409,9 @@
         <w:lastRenderedPageBreak/>
         <w:drawing>
           <wp:inline distT="0" distB="0" distL="0" distR="0">
-            <wp:extent cx="5760720" cy="8835576"/>
-            <wp:effectExtent l="0" t="0" r="0" b="3810"/>
-            <wp:docPr id="21" name="Image 21" descr="D:\l3\Memoire_De_Fin_Cycle\photo\cdpt1.png"/>
+            <wp:extent cx="5537200" cy="8629650"/>
+            <wp:effectExtent l="0" t="0" r="6350" b="0"/>
+            <wp:docPr id="26" name="Image 26"/>
             <wp:cNvGraphicFramePr>
               <a:graphicFrameLocks xmlns:a="http://schemas.openxmlformats.org/drawingml/2006/main" noChangeAspect="1"/>
             </wp:cNvGraphicFramePr>
@@ -28490,36 +28419,29 @@
               <a:graphicData uri="http://schemas.openxmlformats.org/drawingml/2006/picture">
                 <pic:pic xmlns:pic="http://schemas.openxmlformats.org/drawingml/2006/picture">
                   <pic:nvPicPr>
-                    <pic:cNvPr id="0" name="Picture 9" descr="D:\l3\Memoire_De_Fin_Cycle\photo\cdpt1.png"/>
-                    <pic:cNvPicPr>
-                      <a:picLocks noChangeAspect="1" noChangeArrowheads="1"/>
-                    </pic:cNvPicPr>
+                    <pic:cNvPr id="26" name="dirtb.png"/>
+                    <pic:cNvPicPr/>
                   </pic:nvPicPr>
                   <pic:blipFill>
-                    <a:blip r:embed="rId19">
+                    <a:blip r:embed="rId18">
                       <a:extLst>
                         <a:ext uri="{28A0092B-C50C-407E-A947-70E740481C1C}">
                           <a14:useLocalDpi xmlns:a14="http://schemas.microsoft.com/office/drawing/2010/main" val="0"/>
                         </a:ext>
                       </a:extLst>
                     </a:blip>
-                    <a:srcRect/>
                     <a:stretch>
                       <a:fillRect/>
                     </a:stretch>
                   </pic:blipFill>
-                  <pic:spPr bwMode="auto">
+                  <pic:spPr>
                     <a:xfrm>
                       <a:off x="0" y="0"/>
-                      <a:ext cx="5760720" cy="8835576"/>
+                      <a:ext cx="5537200" cy="8629650"/>
                     </a:xfrm>
                     <a:prstGeom prst="rect">
                       <a:avLst/>
                     </a:prstGeom>
-                    <a:noFill/>
-                    <a:ln>
-                      <a:noFill/>
-                    </a:ln>
                   </pic:spPr>
                 </pic:pic>
               </a:graphicData>
@@ -28628,7 +28550,7 @@
                     </pic:cNvPicPr>
                   </pic:nvPicPr>
                   <pic:blipFill>
-                    <a:blip r:embed="rId20">
+                    <a:blip r:embed="rId19">
                       <a:extLst>
                         <a:ext uri="{28A0092B-C50C-407E-A947-70E740481C1C}">
                           <a14:useLocalDpi xmlns:a14="http://schemas.microsoft.com/office/drawing/2010/main" val="0"/>
@@ -28707,6 +28629,19 @@
           <w:szCs w:val="24"/>
         </w:rPr>
       </w:pPr>
+    </w:p>
+    <w:p>
+      <w:pPr>
+        <w:tabs>
+          <w:tab w:val="left" w:pos="5560"/>
+        </w:tabs>
+        <w:ind w:left="360"/>
+        <w:rPr>
+          <w:rFonts w:ascii="Times New Roman" w:hAnsi="Times New Roman" w:cs="Times New Roman"/>
+          <w:sz w:val="24"/>
+          <w:szCs w:val="24"/>
+        </w:rPr>
+      </w:pPr>
       <w:r>
         <w:rPr>
           <w:rFonts w:ascii="Times New Roman" w:hAnsi="Times New Roman" w:cs="Times New Roman"/>
@@ -28718,9 +28653,9 @@
         <w:lastRenderedPageBreak/>
         <w:drawing>
           <wp:inline distT="0" distB="0" distL="0" distR="0">
-            <wp:extent cx="5058137" cy="8964295"/>
-            <wp:effectExtent l="0" t="0" r="9525" b="8255"/>
-            <wp:docPr id="23" name="Image 23" descr="D:\l3\Memoire_De_Fin_Cycle\photo\adm2.png"/>
+            <wp:extent cx="5149850" cy="8892540"/>
+            <wp:effectExtent l="0" t="0" r="0" b="3810"/>
+            <wp:docPr id="28" name="Image 28"/>
             <wp:cNvGraphicFramePr>
               <a:graphicFrameLocks xmlns:a="http://schemas.openxmlformats.org/drawingml/2006/main" noChangeAspect="1"/>
             </wp:cNvGraphicFramePr>
@@ -28728,107 +28663,29 @@
               <a:graphicData uri="http://schemas.openxmlformats.org/drawingml/2006/picture">
                 <pic:pic xmlns:pic="http://schemas.openxmlformats.org/drawingml/2006/picture">
                   <pic:nvPicPr>
-                    <pic:cNvPr id="0" name="Picture 11" descr="D:\l3\Memoire_De_Fin_Cycle\photo\adm2.png"/>
-                    <pic:cNvPicPr>
-                      <a:picLocks noChangeAspect="1" noChangeArrowheads="1"/>
-                    </pic:cNvPicPr>
+                    <pic:cNvPr id="28" name="ad145.png"/>
+                    <pic:cNvPicPr/>
                   </pic:nvPicPr>
                   <pic:blipFill>
-                    <a:blip r:embed="rId21">
+                    <a:blip r:embed="rId20">
                       <a:extLst>
                         <a:ext uri="{28A0092B-C50C-407E-A947-70E740481C1C}">
                           <a14:useLocalDpi xmlns:a14="http://schemas.microsoft.com/office/drawing/2010/main" val="0"/>
                         </a:ext>
                       </a:extLst>
                     </a:blip>
-                    <a:srcRect/>
                     <a:stretch>
                       <a:fillRect/>
                     </a:stretch>
                   </pic:blipFill>
-                  <pic:spPr bwMode="auto">
+                  <pic:spPr>
                     <a:xfrm>
                       <a:off x="0" y="0"/>
-                      <a:ext cx="5060607" cy="8968673"/>
+                      <a:ext cx="5149850" cy="8892540"/>
                     </a:xfrm>
                     <a:prstGeom prst="rect">
                       <a:avLst/>
                     </a:prstGeom>
-                    <a:noFill/>
-                    <a:ln>
-                      <a:noFill/>
-                    </a:ln>
-                  </pic:spPr>
-                </pic:pic>
-              </a:graphicData>
-            </a:graphic>
-          </wp:inline>
-        </w:drawing>
-      </w:r>
-    </w:p>
-    <w:p>
-      <w:pPr>
-        <w:tabs>
-          <w:tab w:val="left" w:pos="5560"/>
-        </w:tabs>
-        <w:ind w:left="360"/>
-        <w:rPr>
-          <w:rFonts w:ascii="Times New Roman" w:hAnsi="Times New Roman" w:cs="Times New Roman"/>
-          <w:sz w:val="24"/>
-          <w:szCs w:val="24"/>
-        </w:rPr>
-      </w:pPr>
-      <w:r>
-        <w:rPr>
-          <w:rFonts w:ascii="Times New Roman" w:hAnsi="Times New Roman" w:cs="Times New Roman"/>
-          <w:noProof/>
-          <w:sz w:val="24"/>
-          <w:szCs w:val="24"/>
-          <w:lang w:eastAsia="fr-FR"/>
-        </w:rPr>
-        <w:lastRenderedPageBreak/>
-        <w:drawing>
-          <wp:inline distT="0" distB="0" distL="0" distR="0">
-            <wp:extent cx="5376440" cy="7418494"/>
-            <wp:effectExtent l="0" t="0" r="0" b="0"/>
-            <wp:docPr id="22" name="Image 22" descr="D:\l3\Memoire_De_Fin_Cycle\photo\ad1.png"/>
-            <wp:cNvGraphicFramePr>
-              <a:graphicFrameLocks xmlns:a="http://schemas.openxmlformats.org/drawingml/2006/main" noChangeAspect="1"/>
-            </wp:cNvGraphicFramePr>
-            <a:graphic xmlns:a="http://schemas.openxmlformats.org/drawingml/2006/main">
-              <a:graphicData uri="http://schemas.openxmlformats.org/drawingml/2006/picture">
-                <pic:pic xmlns:pic="http://schemas.openxmlformats.org/drawingml/2006/picture">
-                  <pic:nvPicPr>
-                    <pic:cNvPr id="0" name="Picture 10" descr="D:\l3\Memoire_De_Fin_Cycle\photo\ad1.png"/>
-                    <pic:cNvPicPr>
-                      <a:picLocks noChangeAspect="1" noChangeArrowheads="1"/>
-                    </pic:cNvPicPr>
-                  </pic:nvPicPr>
-                  <pic:blipFill>
-                    <a:blip r:embed="rId22">
-                      <a:extLst>
-                        <a:ext uri="{28A0092B-C50C-407E-A947-70E740481C1C}">
-                          <a14:useLocalDpi xmlns:a14="http://schemas.microsoft.com/office/drawing/2010/main" val="0"/>
-                        </a:ext>
-                      </a:extLst>
-                    </a:blip>
-                    <a:srcRect/>
-                    <a:stretch>
-                      <a:fillRect/>
-                    </a:stretch>
-                  </pic:blipFill>
-                  <pic:spPr bwMode="auto">
-                    <a:xfrm>
-                      <a:off x="0" y="0"/>
-                      <a:ext cx="5386350" cy="7432168"/>
-                    </a:xfrm>
-                    <a:prstGeom prst="rect">
-                      <a:avLst/>
-                    </a:prstGeom>
-                    <a:noFill/>
-                    <a:ln>
-                      <a:noFill/>
-                    </a:ln>
                   </pic:spPr>
                 </pic:pic>
               </a:graphicData>
@@ -28911,10 +28768,9 @@
           <w:szCs w:val="24"/>
           <w:shd w:val="clear" w:color="auto" w:fill="FFFFFF"/>
         </w:rPr>
-        <w:lastRenderedPageBreak/>
         <w:t>Un </w:t>
       </w:r>
-      <w:hyperlink r:id="rId23" w:history="1">
+      <w:hyperlink r:id="rId21" w:history="1">
         <w:r>
           <w:rPr>
             <w:rStyle w:val="Lienhypertexte"/>
@@ -29032,7 +28888,7 @@
                     </pic:cNvPicPr>
                   </pic:nvPicPr>
                   <pic:blipFill>
-                    <a:blip r:embed="rId24" cstate="print">
+                    <a:blip r:embed="rId22" cstate="print">
                       <a:extLst>
                         <a:ext uri="{28A0092B-C50C-407E-A947-70E740481C1C}">
                           <a14:useLocalDpi xmlns:a14="http://schemas.microsoft.com/office/drawing/2010/main" val="0"/>
@@ -29154,7 +29010,6 @@
           <w:sz w:val="32"/>
           <w:szCs w:val="32"/>
         </w:rPr>
-        <w:lastRenderedPageBreak/>
         <w:t>Quatrième partie</w:t>
       </w:r>
       <w:r>
@@ -29297,7 +29152,7 @@
                     <pic:cNvPicPr/>
                   </pic:nvPicPr>
                   <pic:blipFill>
-                    <a:blip r:embed="rId25" cstate="print">
+                    <a:blip r:embed="rId23" cstate="print">
                       <a:extLst>
                         <a:ext uri="{28A0092B-C50C-407E-A947-70E740481C1C}">
                           <a14:useLocalDpi xmlns:a14="http://schemas.microsoft.com/office/drawing/2010/main" val="0"/>
@@ -29611,7 +29466,7 @@
                     <pic:cNvPicPr/>
                   </pic:nvPicPr>
                   <pic:blipFill>
-                    <a:blip r:embed="rId26" cstate="print">
+                    <a:blip r:embed="rId24" cstate="print">
                       <a:extLst>
                         <a:ext uri="{28A0092B-C50C-407E-A947-70E740481C1C}">
                           <a14:useLocalDpi xmlns:a14="http://schemas.microsoft.com/office/drawing/2010/main" val="0"/>
@@ -29847,6 +29702,7 @@
           <w:szCs w:val="24"/>
           <w:lang w:eastAsia="fr-FR"/>
         </w:rPr>
+        <w:lastRenderedPageBreak/>
         <w:drawing>
           <wp:anchor distT="0" distB="0" distL="114300" distR="114300" simplePos="0" relativeHeight="251663360" behindDoc="1" locked="0" layoutInCell="1" allowOverlap="1" wp14:anchorId="2B4CC019" wp14:editId="3A725327">
             <wp:simplePos x="0" y="0"/>
@@ -29879,7 +29735,7 @@
                     <pic:cNvPicPr/>
                   </pic:nvPicPr>
                   <pic:blipFill>
-                    <a:blip r:embed="rId27">
+                    <a:blip r:embed="rId25">
                       <a:extLst>
                         <a:ext uri="{28A0092B-C50C-407E-A947-70E740481C1C}">
                           <a14:useLocalDpi xmlns:a14="http://schemas.microsoft.com/office/drawing/2010/main" val="0"/>
@@ -29980,7 +29836,6 @@
           <w:szCs w:val="24"/>
           <w:lang w:eastAsia="fr-FR"/>
         </w:rPr>
-        <w:lastRenderedPageBreak/>
         <w:t xml:space="preserve">Java est un langage de programmation orienté objet créé par </w:t>
       </w:r>
       <w:r>
@@ -30176,7 +30031,7 @@
                     <pic:cNvPicPr/>
                   </pic:nvPicPr>
                   <pic:blipFill>
-                    <a:blip r:embed="rId28">
+                    <a:blip r:embed="rId26">
                       <a:extLst>
                         <a:ext uri="{28A0092B-C50C-407E-A947-70E740481C1C}">
                           <a14:useLocalDpi xmlns:a14="http://schemas.microsoft.com/office/drawing/2010/main" val="0"/>
@@ -30537,6 +30392,7 @@
         <w:rPr>
           <w:rStyle w:val="lev"/>
         </w:rPr>
+        <w:lastRenderedPageBreak/>
         <w:t>Coût d'hébergement réduit</w:t>
       </w:r>
       <w:r>
@@ -30567,7 +30423,6 @@
         <w:rPr>
           <w:rStyle w:val="lev"/>
         </w:rPr>
-        <w:lastRenderedPageBreak/>
         <w:t>Écosystème riche</w:t>
       </w:r>
       <w:r>
@@ -30886,6 +30741,7 @@
         <w:spacing w:before="100" w:beforeAutospacing="1" w:after="100" w:afterAutospacing="1" w:line="240" w:lineRule="auto"/>
       </w:pPr>
       <w:r>
+        <w:lastRenderedPageBreak/>
         <w:t>Utilisé comme base par d'autres frameworks (Laravel, Drupal)</w:t>
       </w:r>
     </w:p>
@@ -31000,7 +30856,6 @@
           <w:szCs w:val="24"/>
           <w:lang w:eastAsia="fr-FR"/>
         </w:rPr>
-        <w:lastRenderedPageBreak/>
         <w:t>Configuration minimale requise</w:t>
       </w:r>
     </w:p>
@@ -31495,6 +31350,7 @@
           <w:sz w:val="24"/>
           <w:szCs w:val="24"/>
         </w:rPr>
+        <w:lastRenderedPageBreak/>
         <w:t>MySQL</w:t>
       </w:r>
       <w:r>
@@ -31707,7 +31563,6 @@
           <w:sz w:val="24"/>
           <w:szCs w:val="24"/>
         </w:rPr>
-        <w:lastRenderedPageBreak/>
         <w:t>PostgreSQL</w:t>
       </w:r>
     </w:p>
@@ -32231,6 +32086,7 @@
           <w:sz w:val="24"/>
           <w:szCs w:val="24"/>
         </w:rPr>
+        <w:lastRenderedPageBreak/>
         <w:t xml:space="preserve">Justification du choix du </w:t>
       </w:r>
       <w:r>
@@ -32297,11 +32153,7 @@
       </w:r>
       <w:r>
         <w:br/>
-        <w:t xml:space="preserve">MySQL est compatible avec la quasi-totalité des hébergeurs web disponibles au Sénégal et dans le </w:t>
-      </w:r>
-      <w:r>
-        <w:lastRenderedPageBreak/>
-        <w:t>monde. Cela facilitera le déploiement de l'application sur le serveur du garage Génération Automobile.</w:t>
+        <w:t>MySQL est compatible avec la quasi-totalité des hébergeurs web disponibles au Sénégal et dans le monde. Cela facilitera le déploiement de l'application sur le serveur du garage Génération Automobile.</w:t>
       </w:r>
     </w:p>
     <w:p>
@@ -32496,6 +32348,7 @@
         <w:rPr>
           <w:noProof/>
         </w:rPr>
+        <w:lastRenderedPageBreak/>
         <w:drawing>
           <wp:inline distT="0" distB="0" distL="0" distR="0">
             <wp:extent cx="2539326" cy="1525630"/>
@@ -32514,7 +32367,7 @@
                     </pic:cNvPicPr>
                   </pic:nvPicPr>
                   <pic:blipFill>
-                    <a:blip r:embed="rId29">
+                    <a:blip r:embed="rId27">
                       <a:extLst>
                         <a:ext uri="{28A0092B-C50C-407E-A947-70E740481C1C}">
                           <a14:useLocalDpi xmlns:a14="http://schemas.microsoft.com/office/drawing/2010/main" val="0"/>
@@ -32633,7 +32486,7 @@
                     </pic:cNvPicPr>
                   </pic:nvPicPr>
                   <pic:blipFill>
-                    <a:blip r:embed="rId30" cstate="print">
+                    <a:blip r:embed="rId28" cstate="print">
                       <a:extLst>
                         <a:ext uri="{28A0092B-C50C-407E-A947-70E740481C1C}">
                           <a14:useLocalDpi xmlns:a14="http://schemas.microsoft.com/office/drawing/2010/main" val="0"/>
@@ -32816,7 +32669,7 @@
                     <pic:cNvPicPr/>
                   </pic:nvPicPr>
                   <pic:blipFill>
-                    <a:blip r:embed="rId31">
+                    <a:blip r:embed="rId29">
                       <a:extLst>
                         <a:ext uri="{28A0092B-C50C-407E-A947-70E740481C1C}">
                           <a14:useLocalDpi xmlns:a14="http://schemas.microsoft.com/office/drawing/2010/main" val="0"/>
@@ -33034,6 +32887,7 @@
           <w:szCs w:val="24"/>
           <w:lang w:eastAsia="fr-FR"/>
         </w:rPr>
+        <w:lastRenderedPageBreak/>
         <w:t>Le modèle offre des méthodes pour mettre à jour ces données (insertion suppression, changement de valeur). Il offre aussi des méthodes pour récupérer ses données. Dans le cas de données importantes, le modèle peut autoriser plusieurs vues partielles des données</w:t>
       </w:r>
       <w:r>
@@ -33137,7 +32991,6 @@
           <w:szCs w:val="24"/>
           <w:shd w:val="clear" w:color="auto" w:fill="FFFFFF"/>
         </w:rPr>
-        <w:lastRenderedPageBreak/>
         <w:t>Contrôleur</w:t>
       </w:r>
     </w:p>
@@ -34336,7 +34189,7 @@
                     </pic:cNvPicPr>
                   </pic:nvPicPr>
                   <pic:blipFill>
-                    <a:blip r:embed="rId32" cstate="print">
+                    <a:blip r:embed="rId30" cstate="print">
                       <a:extLst>
                         <a:ext uri="{28A0092B-C50C-407E-A947-70E740481C1C}">
                           <a14:useLocalDpi xmlns:a14="http://schemas.microsoft.com/office/drawing/2010/main" val="0"/>
@@ -34464,6 +34317,7 @@
           <w:szCs w:val="24"/>
           <w:lang w:eastAsia="fr-FR"/>
         </w:rPr>
+        <w:lastRenderedPageBreak/>
         <w:t>- Serveur MySQL   : localhost (port 3306)</w:t>
       </w:r>
     </w:p>
@@ -34601,7 +34455,6 @@
         <w:rPr>
           <w:lang w:val="en-GB"/>
         </w:rPr>
-        <w:lastRenderedPageBreak/>
         <w:t>DB_CONNECTION=MySQL</w:t>
       </w:r>
     </w:p>
@@ -34963,6 +34816,7 @@
         <w:spacing w:before="0" w:beforeAutospacing="0" w:after="0" w:afterAutospacing="0"/>
       </w:pPr>
       <w:r>
+        <w:lastRenderedPageBreak/>
         <w:t>php artisan breeze:install</w:t>
       </w:r>
     </w:p>
@@ -35016,7 +34870,6 @@
         <w:rPr>
           <w:b/>
         </w:rPr>
-        <w:lastRenderedPageBreak/>
         <w:t xml:space="preserve">Authentification des utilisateurs </w:t>
       </w:r>
     </w:p>
@@ -35286,6 +35139,237 @@
       <w:pPr>
         <w:pStyle w:val="font-claude-response-body"/>
       </w:pPr>
+    </w:p>
+    <w:p>
+      <w:pPr>
+        <w:shd w:val="clear" w:color="auto" w:fill="FFFFFF"/>
+        <w:spacing w:before="100" w:beforeAutospacing="1" w:after="100" w:afterAutospacing="1" w:line="240" w:lineRule="auto"/>
+        <w:rPr>
+          <w:rFonts w:ascii="Segoe UI" w:eastAsia="Times New Roman" w:hAnsi="Segoe UI" w:cs="Segoe UI"/>
+          <w:color w:val="2B2D38"/>
+          <w:sz w:val="23"/>
+          <w:szCs w:val="23"/>
+          <w:lang w:eastAsia="fr-FR"/>
+        </w:rPr>
+      </w:pPr>
+      <w:r>
+        <w:rPr>
+          <w:rFonts w:ascii="Segoe UI" w:eastAsia="Times New Roman" w:hAnsi="Segoe UI" w:cs="Segoe UI"/>
+          <w:color w:val="2B2D38"/>
+          <w:sz w:val="23"/>
+          <w:szCs w:val="23"/>
+          <w:lang w:eastAsia="fr-FR"/>
+        </w:rPr>
+        <w:lastRenderedPageBreak/>
+        <w:t>NTRODUCTION GÉNÉRALE</w:t>
+      </w:r>
+    </w:p>
+    <w:p>
+      <w:pPr>
+        <w:shd w:val="clear" w:color="auto" w:fill="FFFFFF"/>
+        <w:spacing w:before="150" w:after="100" w:afterAutospacing="1" w:line="240" w:lineRule="auto"/>
+        <w:rPr>
+          <w:rFonts w:ascii="Segoe UI" w:eastAsia="Times New Roman" w:hAnsi="Segoe UI" w:cs="Segoe UI"/>
+          <w:color w:val="2B2D38"/>
+          <w:sz w:val="23"/>
+          <w:szCs w:val="23"/>
+          <w:lang w:eastAsia="fr-FR"/>
+        </w:rPr>
+      </w:pPr>
+      <w:r>
+        <w:rPr>
+          <w:rFonts w:ascii="Segoe UI" w:eastAsia="Times New Roman" w:hAnsi="Segoe UI" w:cs="Segoe UI"/>
+          <w:color w:val="2B2D38"/>
+          <w:sz w:val="23"/>
+          <w:szCs w:val="23"/>
+          <w:lang w:eastAsia="fr-FR"/>
+        </w:rPr>
+        <w:t>Dans un monde en constante évolution technologique, la digitalisation des processus métier est devenue une nécessité pour les entreprises qui veulent rester compétitives et améliorer la qualité de leurs services. Le secteur de l'automobile, et en particulier la maintenance et la réparation de véhicules, ne fait pas exception. Les garages automobiles doivent aujourd'hui faire face à des défis croissants : gérer efficacement les interventions techniques, suivre les clients, assurer une traçabilité des opérations et répondre rapidement aux demandes.</w:t>
+      </w:r>
+    </w:p>
+    <w:p>
+      <w:pPr>
+        <w:shd w:val="clear" w:color="auto" w:fill="FFFFFF"/>
+        <w:spacing w:before="150" w:after="100" w:afterAutospacing="1" w:line="240" w:lineRule="auto"/>
+        <w:rPr>
+          <w:rFonts w:ascii="Segoe UI" w:eastAsia="Times New Roman" w:hAnsi="Segoe UI" w:cs="Segoe UI"/>
+          <w:color w:val="2B2D38"/>
+          <w:sz w:val="23"/>
+          <w:szCs w:val="23"/>
+          <w:lang w:eastAsia="fr-FR"/>
+        </w:rPr>
+      </w:pPr>
+      <w:r>
+        <w:rPr>
+          <w:rFonts w:ascii="Segoe UI" w:eastAsia="Times New Roman" w:hAnsi="Segoe UI" w:cs="Segoe UI"/>
+          <w:color w:val="2B2D38"/>
+          <w:sz w:val="23"/>
+          <w:szCs w:val="23"/>
+          <w:lang w:eastAsia="fr-FR"/>
+        </w:rPr>
+        <w:t>C'est dans ce contexte que s'inscrit cette mémoire, réalisée au sein du garage Génération Automobile, une structure spécialisée dans la maintenance et la réparation automobile. Comme de nombreuses entreprises de ce secteur, ce garage doit traiter chaque jour un volume important d'interventions, de demandes clients et de ressources matérielles. Pourtant, l'absence d'un système d'information adapté entraîne de nombreux problèmes : perte d'informations, difficulté à suivre les interventions, retards dans la prise en charge des demandes, et risques d'erreurs lors de la facturation.</w:t>
+      </w:r>
+    </w:p>
+    <w:p>
+      <w:pPr>
+        <w:shd w:val="clear" w:color="auto" w:fill="FFFFFF"/>
+        <w:spacing w:before="150" w:after="100" w:afterAutospacing="1" w:line="240" w:lineRule="auto"/>
+        <w:rPr>
+          <w:rFonts w:ascii="Segoe UI" w:eastAsia="Times New Roman" w:hAnsi="Segoe UI" w:cs="Segoe UI"/>
+          <w:color w:val="2B2D38"/>
+          <w:sz w:val="23"/>
+          <w:szCs w:val="23"/>
+          <w:lang w:eastAsia="fr-FR"/>
+        </w:rPr>
+      </w:pPr>
+      <w:r>
+        <w:rPr>
+          <w:rFonts w:ascii="Segoe UI" w:eastAsia="Times New Roman" w:hAnsi="Segoe UI" w:cs="Segoe UI"/>
+          <w:color w:val="2B2D38"/>
+          <w:sz w:val="23"/>
+          <w:szCs w:val="23"/>
+          <w:lang w:eastAsia="fr-FR"/>
+        </w:rPr>
+        <w:t>Face à ces difficultés, une question essentielle se pose : comment concevoir et développer une application informatique capable de centraliser, automatiser et optimiser la gestion des interventions au sein du garage Génération Automobile ?</w:t>
+      </w:r>
+    </w:p>
+    <w:p>
+      <w:pPr>
+        <w:shd w:val="clear" w:color="auto" w:fill="FFFFFF"/>
+        <w:spacing w:before="150" w:after="100" w:afterAutospacing="1" w:line="240" w:lineRule="auto"/>
+        <w:rPr>
+          <w:rFonts w:ascii="Segoe UI" w:eastAsia="Times New Roman" w:hAnsi="Segoe UI" w:cs="Segoe UI"/>
+          <w:color w:val="2B2D38"/>
+          <w:sz w:val="23"/>
+          <w:szCs w:val="23"/>
+          <w:lang w:eastAsia="fr-FR"/>
+        </w:rPr>
+      </w:pPr>
+      <w:r>
+        <w:rPr>
+          <w:rFonts w:ascii="Segoe UI" w:eastAsia="Times New Roman" w:hAnsi="Segoe UI" w:cs="Segoe UI"/>
+          <w:color w:val="2B2D38"/>
+          <w:sz w:val="23"/>
+          <w:szCs w:val="23"/>
+          <w:lang w:eastAsia="fr-FR"/>
+        </w:rPr>
+        <w:t>Notre objectif principal est donc de concevoir et de développer une application de gestion des interventions adaptée aux besoins spécifiques de ce garage. Pour y parvenir, nous nous fixons plusieurs objectifs précis :</w:t>
+      </w:r>
+    </w:p>
+    <w:p>
+      <w:pPr>
+        <w:shd w:val="clear" w:color="auto" w:fill="FFFFFF"/>
+        <w:spacing w:before="150" w:after="100" w:afterAutospacing="1" w:line="240" w:lineRule="auto"/>
+        <w:rPr>
+          <w:rFonts w:ascii="Segoe UI" w:eastAsia="Times New Roman" w:hAnsi="Segoe UI" w:cs="Segoe UI"/>
+          <w:color w:val="2B2D38"/>
+          <w:sz w:val="23"/>
+          <w:szCs w:val="23"/>
+          <w:lang w:eastAsia="fr-FR"/>
+        </w:rPr>
+      </w:pPr>
+      <w:r>
+        <w:rPr>
+          <w:rFonts w:ascii="Segoe UI" w:eastAsia="Times New Roman" w:hAnsi="Segoe UI" w:cs="Segoe UI"/>
+          <w:color w:val="2B2D38"/>
+          <w:sz w:val="23"/>
+          <w:szCs w:val="23"/>
+          <w:lang w:eastAsia="fr-FR"/>
+        </w:rPr>
+        <w:t>- Analyser le fonctionnement actuel du garage et identifier les faiblesses du système existant ;</w:t>
+      </w:r>
+    </w:p>
+    <w:p>
+      <w:pPr>
+        <w:shd w:val="clear" w:color="auto" w:fill="FFFFFF"/>
+        <w:spacing w:before="150" w:after="100" w:afterAutospacing="1" w:line="240" w:lineRule="auto"/>
+        <w:rPr>
+          <w:rFonts w:ascii="Segoe UI" w:eastAsia="Times New Roman" w:hAnsi="Segoe UI" w:cs="Segoe UI"/>
+          <w:color w:val="2B2D38"/>
+          <w:sz w:val="23"/>
+          <w:szCs w:val="23"/>
+          <w:lang w:eastAsia="fr-FR"/>
+        </w:rPr>
+      </w:pPr>
+      <w:r>
+        <w:rPr>
+          <w:rFonts w:ascii="Segoe UI" w:eastAsia="Times New Roman" w:hAnsi="Segoe UI" w:cs="Segoe UI"/>
+          <w:color w:val="2B2D38"/>
+          <w:sz w:val="23"/>
+          <w:szCs w:val="23"/>
+          <w:lang w:eastAsia="fr-FR"/>
+        </w:rPr>
+        <w:t>- Recenser et définir les besoins fonctionnels et non fonctionnels de la future application ;</w:t>
+      </w:r>
+    </w:p>
+    <w:p>
+      <w:pPr>
+        <w:shd w:val="clear" w:color="auto" w:fill="FFFFFF"/>
+        <w:spacing w:before="150" w:after="100" w:afterAutospacing="1" w:line="240" w:lineRule="auto"/>
+        <w:rPr>
+          <w:rFonts w:ascii="Segoe UI" w:eastAsia="Times New Roman" w:hAnsi="Segoe UI" w:cs="Segoe UI"/>
+          <w:color w:val="2B2D38"/>
+          <w:sz w:val="23"/>
+          <w:szCs w:val="23"/>
+          <w:lang w:eastAsia="fr-FR"/>
+        </w:rPr>
+      </w:pPr>
+      <w:r>
+        <w:rPr>
+          <w:rFonts w:ascii="Segoe UI" w:eastAsia="Times New Roman" w:hAnsi="Segoe UI" w:cs="Segoe UI"/>
+          <w:color w:val="2B2D38"/>
+          <w:sz w:val="23"/>
+          <w:szCs w:val="23"/>
+          <w:lang w:eastAsia="fr-FR"/>
+        </w:rPr>
+        <w:t>- Concevoir la solution à l'aide de diagrammes UML ;</w:t>
+      </w:r>
+    </w:p>
+    <w:p>
+      <w:pPr>
+        <w:shd w:val="clear" w:color="auto" w:fill="FFFFFF"/>
+        <w:spacing w:before="150" w:after="100" w:afterAutospacing="1" w:line="240" w:lineRule="auto"/>
+        <w:rPr>
+          <w:rFonts w:ascii="Segoe UI" w:eastAsia="Times New Roman" w:hAnsi="Segoe UI" w:cs="Segoe UI"/>
+          <w:color w:val="2B2D38"/>
+          <w:sz w:val="23"/>
+          <w:szCs w:val="23"/>
+          <w:lang w:eastAsia="fr-FR"/>
+        </w:rPr>
+      </w:pPr>
+      <w:r>
+        <w:rPr>
+          <w:rFonts w:ascii="Segoe UI" w:eastAsia="Times New Roman" w:hAnsi="Segoe UI" w:cs="Segoe UI"/>
+          <w:color w:val="2B2D38"/>
+          <w:sz w:val="23"/>
+          <w:szCs w:val="23"/>
+          <w:lang w:eastAsia="fr-FR"/>
+        </w:rPr>
+        <w:t>- Implémenter et déployer cette application en utilisant des technologies appropriées.</w:t>
+      </w:r>
+    </w:p>
+    <w:p>
+      <w:pPr>
+        <w:shd w:val="clear" w:color="auto" w:fill="FFFFFF"/>
+        <w:spacing w:before="150" w:after="100" w:afterAutospacing="1" w:line="240" w:lineRule="auto"/>
+        <w:rPr>
+          <w:rFonts w:ascii="Segoe UI" w:eastAsia="Times New Roman" w:hAnsi="Segoe UI" w:cs="Segoe UI"/>
+          <w:color w:val="2B2D38"/>
+          <w:sz w:val="23"/>
+          <w:szCs w:val="23"/>
+          <w:lang w:eastAsia="fr-FR"/>
+        </w:rPr>
+      </w:pPr>
+      <w:r>
+        <w:rPr>
+          <w:rFonts w:ascii="Segoe UI" w:eastAsia="Times New Roman" w:hAnsi="Segoe UI" w:cs="Segoe UI"/>
+          <w:color w:val="2B2D38"/>
+          <w:sz w:val="23"/>
+          <w:szCs w:val="23"/>
+          <w:lang w:eastAsia="fr-FR"/>
+        </w:rPr>
+        <w:t>Ce travail s'inscrit ainsi dans une démarche concrète et pratique, visant à apporter une solution numérique innovante et pertinente au quotidien du garage.</w:t>
+      </w:r>
     </w:p>
     <w:p>
       <w:pPr>
@@ -35396,7 +35480,7 @@
         <v:path o:extrusionok="f" gradientshapeok="t" o:connecttype="rect"/>
         <o:lock v:ext="edit" aspectratio="t"/>
       </v:shapetype>
-      <v:shape id="_x0000_i1029" type="#_x0000_t75" style="width:11.4pt;height:11.4pt" o:bullet="t">
+      <v:shape id="_x0000_i1073" type="#_x0000_t75" style="width:11.5pt;height:11.5pt" o:bullet="t">
         <v:imagedata r:id="rId1" o:title="mso3B8"/>
       </v:shape>
     </w:pict>
@@ -42041,7 +42125,7 @@
 </file>
 
 <file path=customXml/itemProps1.xml><?xml version="1.0" encoding="utf-8"?>
-<ds:datastoreItem xmlns:ds="http://schemas.openxmlformats.org/officeDocument/2006/customXml" ds:itemID="{49ABEF56-E91C-463A-B83F-285E7FB75030}">
+<ds:datastoreItem xmlns:ds="http://schemas.openxmlformats.org/officeDocument/2006/customXml" ds:itemID="{067842B1-D428-4DB6-9CAF-E99632AD7016}">
   <ds:schemaRefs>
     <ds:schemaRef ds:uri="http://schemas.openxmlformats.org/officeDocument/2006/bibliography"/>
   </ds:schemaRefs>

</xml_diff>